<commit_message>
Update lab report: replace all 17 figures with user-generated screenshots
</commit_message>
<xml_diff>
--- a/Отчет_5.docx
+++ b/Отчет_5.docx
@@ -3212,158 +3212,28 @@
     <w:p>
       <w:pPr>
         <w:pStyle w:val="a3"/>
+        <w:spacing w:before="160" w:after="60"/>
         <w:ind w:firstLine="0"/>
         <w:jc w:val="center"/>
       </w:pPr>
-      <w:r>
-        <w:rPr>
-          <w:noProof/>
-          <w14:ligatures w14:val="standardContextual"/>
-        </w:rPr>
+      <w:r/>
+      <w:r>
         <w:drawing>
-          <wp:inline distT="0" distB="0" distL="0" distR="0" wp14:anchorId="5D9988BD" wp14:editId="737F444B">
-            <wp:extent cx="4900436" cy="2450754"/>
-            <wp:effectExtent l="0" t="0" r="1905" b="635"/>
-            <wp:docPr id="221808607" name="Рисунок 1" descr="Изображение выглядит как снимок экрана, текст&#10;&#10;Автоматически созданное описание"/>
+          <wp:inline xmlns:a="http://schemas.openxmlformats.org/drawingml/2006/main" xmlns:pic="http://schemas.openxmlformats.org/drawingml/2006/picture">
+            <wp:extent cx="5760000" cy="849318"/>
+            <wp:docPr id="1845347440" name="Picture 1845347440"/>
             <wp:cNvGraphicFramePr>
-              <a:graphicFrameLocks xmlns:a="http://schemas.openxmlformats.org/drawingml/2006/main" noChangeAspect="1"/>
+              <a:graphicFrameLocks noChangeAspect="1"/>
             </wp:cNvGraphicFramePr>
-            <a:graphic xmlns:a="http://schemas.openxmlformats.org/drawingml/2006/main">
+            <a:graphic>
               <a:graphicData uri="http://schemas.openxmlformats.org/drawingml/2006/picture">
-                <pic:pic xmlns:pic="http://schemas.openxmlformats.org/drawingml/2006/picture">
+                <pic:pic>
                   <pic:nvPicPr>
-                    <pic:cNvPr id="221808607" name="Рисунок 1" descr="Изображение выглядит как снимок экрана, текст&#10;&#10;Автоматически созданное описание"/>
-                    <pic:cNvPicPr/>
-                  </pic:nvPicPr>
-                  <pic:blipFill rotWithShape="1">
-                    <a:blip r:embed="rId6">
-                      <a:extLst>
-                        <a:ext uri="{28A0092B-C50C-407E-A947-70E740481C1C}">
-                          <a14:useLocalDpi xmlns:a14="http://schemas.microsoft.com/office/drawing/2010/main" val="0"/>
-                        </a:ext>
-                      </a:extLst>
-                    </a:blip>
-                    <a:srcRect l="1966" t="30207" r="43013" b="18000"/>
-                    <a:stretch/>
-                  </pic:blipFill>
-                  <pic:spPr bwMode="auto">
-                    <a:xfrm>
-                      <a:off x="0" y="0"/>
-                      <a:ext cx="4972715" cy="2486901"/>
-                    </a:xfrm>
-                    <a:prstGeom prst="rect">
-                      <a:avLst/>
-                    </a:prstGeom>
-                    <a:ln>
-                      <a:noFill/>
-                    </a:ln>
-                    <a:extLst>
-                      <a:ext uri="{53640926-AAD7-44D8-BBD7-CCE9431645EC}">
-                        <a14:shadowObscured xmlns:a14="http://schemas.microsoft.com/office/drawing/2010/main"/>
-                      </a:ext>
-                    </a:extLst>
-                  </pic:spPr>
-                </pic:pic>
-              </a:graphicData>
-            </a:graphic>
-          </wp:inline>
-        </w:drawing>
-      </w:r>
-    </w:p>
-    <w:p>
-      <w:pPr>
-        <w:pStyle w:val="af1"/>
-        <w:jc w:val="center"/>
-      </w:pPr>
-      <w:r>
-        <w:rPr>
-          <w:rFonts w:ascii="Times New Roman" w:hAnsi="Times New Roman"/>
-          <w:b w:val="0"/>
-          <w:i/>
-          <w:color w:val="000000"/>
-          <w:sz w:val="24"/>
-        </w:rPr>
-        <w:t>Рис. 1.1. Версия JDK и Gradle.</w:t>
-      </w:r>
-    </w:p>
-    <w:p>
-      <w:pPr>
-        <w:pStyle w:val="a3"/>
-      </w:pPr>
-      <w:r>
-        <w:t xml:space="preserve">После сборки проекта в директории </w:t>
-      </w:r>
-      <w:r>
-        <w:rPr>
-          <w:i/>
-          <w:iCs/>
-          <w:lang w:val="en-US"/>
-        </w:rPr>
-        <w:t>build</w:t>
-      </w:r>
-      <w:r>
-        <w:rPr>
-          <w:i/>
-          <w:iCs/>
-        </w:rPr>
-        <w:t>/</w:t>
-      </w:r>
-      <w:r>
-        <w:rPr>
-          <w:i/>
-          <w:iCs/>
-          <w:lang w:val="en-US"/>
-        </w:rPr>
-        <w:t>distributions</w:t>
-      </w:r>
-      <w:r>
-        <w:rPr>
-          <w:i/>
-          <w:iCs/>
-        </w:rPr>
-        <w:t>/</w:t>
-      </w:r>
-      <w:r>
-        <w:t xml:space="preserve"> </w:t>
-      </w:r>
-      <w:r>
-        <w:t xml:space="preserve">появится архив с дистрибутивом собранного проекта. Разархивируем его и посмотрим на содержимое: </w:t>
-      </w:r>
-    </w:p>
-    <w:p>
-      <w:pPr>
-        <w:pStyle w:val="a3"/>
-        <w:ind w:firstLine="0"/>
-        <w:jc w:val="center"/>
-      </w:pPr>
-      <w:r>
-        <w:rPr>
-          <w:noProof/>
-          <w14:ligatures w14:val="standardContextual"/>
-        </w:rPr>
-        <w:drawing>
-          <wp:inline distT="0" distB="0" distL="0" distR="0" wp14:anchorId="44580388" wp14:editId="0D2EDCA0">
-            <wp:extent cx="2321966" cy="1256773"/>
-            <wp:effectExtent l="0" t="0" r="2540" b="635"/>
-            <wp:docPr id="1237420687" name="Рисунок 2"/>
-            <wp:cNvGraphicFramePr>
-              <a:graphicFrameLocks xmlns:a="http://schemas.openxmlformats.org/drawingml/2006/main" noChangeAspect="1"/>
-            </wp:cNvGraphicFramePr>
-            <a:graphic xmlns:a="http://schemas.openxmlformats.org/drawingml/2006/main">
-              <a:graphicData uri="http://schemas.openxmlformats.org/drawingml/2006/picture">
-                <pic:pic xmlns:pic="http://schemas.openxmlformats.org/drawingml/2006/picture">
-                  <pic:nvPicPr>
-                    <pic:cNvPr id="1237420687" name="Рисунок 1237420687"/>
+                    <pic:cNvPr id="0" name="Снимок экрана 2026-10-25 180146.png"/>
                     <pic:cNvPicPr/>
                   </pic:nvPicPr>
                   <pic:blipFill>
-                    <a:blip r:embed="rId7">
-                      <a:extLst>
-                        <a:ext uri="{28A0092B-C50C-407E-A947-70E740481C1C}">
-                          <a14:useLocalDpi xmlns:a14="http://schemas.microsoft.com/office/drawing/2010/main" val="0"/>
-                        </a:ext>
-                      </a:extLst>
-                    </a:blip>
+                    <a:blip r:embed="rId23"/>
                     <a:stretch>
                       <a:fillRect/>
                     </a:stretch>
@@ -3371,11 +3241,9 @@
                   <pic:spPr>
                     <a:xfrm>
                       <a:off x="0" y="0"/>
-                      <a:ext cx="2356826" cy="1275641"/>
+                      <a:ext cx="5760000" cy="849318"/>
                     </a:xfrm>
-                    <a:prstGeom prst="rect">
-                      <a:avLst/>
-                    </a:prstGeom>
+                    <a:prstGeom prst="rect"/>
                   </pic:spPr>
                 </pic:pic>
               </a:graphicData>
@@ -3397,7 +3265,7 @@
           <w:color w:val="000000"/>
           <w:sz w:val="24"/>
         </w:rPr>
-        <w:t>Рис. 1.2. Содержимое дистрибутива.</w:t>
+        <w:t>Рис. 1.1. Версия JDK и Gradle.</w:t>
       </w:r>
     </w:p>
     <w:p>
@@ -3405,250 +3273,70 @@
         <w:pStyle w:val="a3"/>
       </w:pPr>
       <w:r>
-        <w:lastRenderedPageBreak/>
-        <w:t>Дистрибутив до выполнения скриптов состоит из 5 директорий:</w:t>
+        <w:t xml:space="preserve">После сборки проекта в директории </w:t>
+      </w:r>
+      <w:r>
+        <w:rPr>
+          <w:i/>
+          <w:iCs/>
+          <w:lang w:val="en-US"/>
+        </w:rPr>
+        <w:t>build</w:t>
+      </w:r>
+      <w:r>
+        <w:rPr>
+          <w:i/>
+          <w:iCs/>
+        </w:rPr>
+        <w:t>/</w:t>
+      </w:r>
+      <w:r>
+        <w:rPr>
+          <w:i/>
+          <w:iCs/>
+          <w:lang w:val="en-US"/>
+        </w:rPr>
+        <w:t>distributions</w:t>
+      </w:r>
+      <w:r>
+        <w:rPr>
+          <w:i/>
+          <w:iCs/>
+        </w:rPr>
+        <w:t>/</w:t>
+      </w:r>
+      <w:r>
+        <w:t xml:space="preserve"> </w:t>
+      </w:r>
+      <w:r>
+        <w:t xml:space="preserve">появится архив с дистрибутивом собранного проекта. Разархивируем его и посмотрим на содержимое: </w:t>
       </w:r>
     </w:p>
     <w:p>
       <w:pPr>
         <w:pStyle w:val="a3"/>
-        <w:numPr>
-          <w:ilvl w:val="0"/>
-          <w:numId w:val="3"/>
-        </w:numPr>
-      </w:pPr>
-      <w:r>
-        <w:rPr>
-          <w:lang w:val="en-US"/>
-        </w:rPr>
-        <w:t xml:space="preserve">bin – </w:t>
-      </w:r>
-      <w:r>
-        <w:t xml:space="preserve">директория со </w:t>
-      </w:r>
-      <w:proofErr w:type="gramStart"/>
-      <w:r>
-        <w:t>скриптами</w:t>
-      </w:r>
-      <w:r>
-        <w:rPr>
-          <w:lang w:val="en-US"/>
-        </w:rPr>
-        <w:t>;</w:t>
-      </w:r>
-      <w:proofErr w:type="gramEnd"/>
-    </w:p>
-    <w:p>
-      <w:pPr>
-        <w:pStyle w:val="a3"/>
-        <w:numPr>
-          <w:ilvl w:val="0"/>
-          <w:numId w:val="3"/>
-        </w:numPr>
-      </w:pPr>
-      <w:r>
-        <w:rPr>
-          <w:lang w:val="en-US"/>
-        </w:rPr>
-        <w:t>config</w:t>
-      </w:r>
-      <w:r>
-        <w:t xml:space="preserve"> – </w:t>
-      </w:r>
-      <w:r>
-        <w:t xml:space="preserve">директория с конфигурационными </w:t>
-      </w:r>
-      <w:proofErr w:type="gramStart"/>
-      <w:r>
-        <w:t>файлами</w:t>
-      </w:r>
-      <w:r>
-        <w:t>;</w:t>
-      </w:r>
-      <w:proofErr w:type="gramEnd"/>
-    </w:p>
-    <w:p>
-      <w:pPr>
-        <w:pStyle w:val="a3"/>
-        <w:numPr>
-          <w:ilvl w:val="0"/>
-          <w:numId w:val="3"/>
-        </w:numPr>
-      </w:pPr>
-      <w:r>
-        <w:rPr>
-          <w:lang w:val="en-US"/>
-        </w:rPr>
-        <w:t>docs</w:t>
-      </w:r>
-      <w:r>
-        <w:t xml:space="preserve"> – </w:t>
-      </w:r>
-      <w:r>
-        <w:t>директория</w:t>
-      </w:r>
-      <w:r>
-        <w:t xml:space="preserve"> </w:t>
-      </w:r>
-      <w:r>
-        <w:t xml:space="preserve">с документацией </w:t>
-      </w:r>
-      <w:proofErr w:type="gramStart"/>
-      <w:r>
-        <w:rPr>
-          <w:lang w:val="en-US"/>
-        </w:rPr>
-        <w:t>Kafka</w:t>
-      </w:r>
-      <w:r>
-        <w:t>;</w:t>
-      </w:r>
-      <w:proofErr w:type="gramEnd"/>
-    </w:p>
-    <w:p>
-      <w:pPr>
-        <w:pStyle w:val="a3"/>
-        <w:numPr>
-          <w:ilvl w:val="0"/>
-          <w:numId w:val="3"/>
-        </w:numPr>
-      </w:pPr>
-      <w:r>
-        <w:rPr>
-          <w:lang w:val="en-US"/>
-        </w:rPr>
-        <w:t>lib</w:t>
-      </w:r>
-      <w:r>
-        <w:t xml:space="preserve"> – </w:t>
-      </w:r>
-      <w:r>
-        <w:t xml:space="preserve">директория с используемыми библиотеками в проекте в формате </w:t>
-      </w:r>
-      <w:r>
-        <w:t>.</w:t>
-      </w:r>
-      <w:proofErr w:type="gramStart"/>
-      <w:r>
-        <w:rPr>
-          <w:lang w:val="en-US"/>
-        </w:rPr>
-        <w:t>jar</w:t>
-      </w:r>
-      <w:r>
-        <w:t>;</w:t>
-      </w:r>
-      <w:proofErr w:type="gramEnd"/>
-    </w:p>
-    <w:p>
-      <w:pPr>
-        <w:pStyle w:val="a3"/>
-        <w:numPr>
-          <w:ilvl w:val="0"/>
-          <w:numId w:val="3"/>
-        </w:numPr>
-      </w:pPr>
-      <w:r>
-        <w:rPr>
-          <w:lang w:val="en-US"/>
-        </w:rPr>
-        <w:t>rules</w:t>
-      </w:r>
-      <w:r>
-        <w:t xml:space="preserve"> – </w:t>
-      </w:r>
-      <w:r>
-        <w:t xml:space="preserve">директория с правилами на языке </w:t>
-      </w:r>
-      <w:r>
-        <w:rPr>
-          <w:lang w:val="en-US"/>
-        </w:rPr>
-        <w:t>Drools</w:t>
-      </w:r>
-      <w:r>
-        <w:t>.</w:t>
-      </w:r>
-    </w:p>
-    <w:p>
-      <w:pPr>
-        <w:pStyle w:val="a3"/>
-      </w:pPr>
-      <w:r>
-        <w:t xml:space="preserve">Откроем файл конфигурации </w:t>
-      </w:r>
-      <w:r>
-        <w:rPr>
-          <w:lang w:val="en-US"/>
-        </w:rPr>
-        <w:t>config</w:t>
-      </w:r>
-      <w:r>
-        <w:t>/</w:t>
-      </w:r>
-      <w:r>
-        <w:rPr>
-          <w:lang w:val="en-US"/>
-        </w:rPr>
-        <w:t>configuration</w:t>
-      </w:r>
-      <w:r>
-        <w:t>.</w:t>
-      </w:r>
-      <w:proofErr w:type="spellStart"/>
-      <w:r>
-        <w:rPr>
-          <w:lang w:val="en-US"/>
-        </w:rPr>
-        <w:t>yml</w:t>
-      </w:r>
-      <w:proofErr w:type="spellEnd"/>
-      <w:r>
-        <w:t xml:space="preserve"> и просмотрим строки </w:t>
-      </w:r>
-      <w:proofErr w:type="gramStart"/>
-      <w:r>
-        <w:t>1-28</w:t>
-      </w:r>
-      <w:proofErr w:type="gramEnd"/>
-      <w:r>
-        <w:t>:</w:t>
-      </w:r>
-    </w:p>
-    <w:p>
-      <w:pPr>
-        <w:pStyle w:val="a3"/>
+        <w:spacing w:before="160" w:after="60"/>
         <w:ind w:firstLine="0"/>
         <w:jc w:val="center"/>
       </w:pPr>
-      <w:r>
-        <w:rPr>
-          <w:noProof/>
-          <w14:ligatures w14:val="standardContextual"/>
-        </w:rPr>
+      <w:r/>
+      <w:r>
         <w:drawing>
-          <wp:inline distT="0" distB="0" distL="0" distR="0" wp14:anchorId="432B5D1A" wp14:editId="0F1B8C33">
-            <wp:extent cx="4966714" cy="2762885"/>
-            <wp:effectExtent l="0" t="0" r="0" b="5715"/>
-            <wp:docPr id="914479980" name="Рисунок 4" descr="Изображение выглядит как текст, алгебра, снимок экрана&#10;&#10;Автоматически созданное описание"/>
+          <wp:inline xmlns:a="http://schemas.openxmlformats.org/drawingml/2006/main" xmlns:pic="http://schemas.openxmlformats.org/drawingml/2006/picture">
+            <wp:extent cx="5760000" cy="2768571"/>
+            <wp:docPr id="1845347441" name="Picture 1845347441"/>
             <wp:cNvGraphicFramePr>
-              <a:graphicFrameLocks xmlns:a="http://schemas.openxmlformats.org/drawingml/2006/main" noChangeAspect="1"/>
+              <a:graphicFrameLocks noChangeAspect="1"/>
             </wp:cNvGraphicFramePr>
-            <a:graphic xmlns:a="http://schemas.openxmlformats.org/drawingml/2006/main">
+            <a:graphic>
               <a:graphicData uri="http://schemas.openxmlformats.org/drawingml/2006/picture">
-                <pic:pic xmlns:pic="http://schemas.openxmlformats.org/drawingml/2006/picture">
+                <pic:pic>
                   <pic:nvPicPr>
-                    <pic:cNvPr id="914479980" name="Рисунок 4" descr="Изображение выглядит как текст, алгебра, снимок экрана&#10;&#10;Автоматически созданное описание"/>
+                    <pic:cNvPr id="0" name="Снимок экрана 2026-10-25 180305.png"/>
                     <pic:cNvPicPr/>
                   </pic:nvPicPr>
                   <pic:blipFill>
-                    <a:blip r:embed="rId8" cstate="print">
-                      <a:extLst>
-                        <a:ext uri="{28A0092B-C50C-407E-A947-70E740481C1C}">
-                          <a14:useLocalDpi xmlns:a14="http://schemas.microsoft.com/office/drawing/2010/main" val="0"/>
-                        </a:ext>
-                      </a:extLst>
-                    </a:blip>
+                    <a:blip r:embed="rId24"/>
                     <a:stretch>
                       <a:fillRect/>
                     </a:stretch>
@@ -3656,11 +3344,9 @@
                   <pic:spPr>
                     <a:xfrm>
                       <a:off x="0" y="0"/>
-                      <a:ext cx="4990635" cy="2776192"/>
+                      <a:ext cx="5760000" cy="2768571"/>
                     </a:xfrm>
-                    <a:prstGeom prst="rect">
-                      <a:avLst/>
-                    </a:prstGeom>
+                    <a:prstGeom prst="rect"/>
                   </pic:spPr>
                 </pic:pic>
               </a:graphicData>
@@ -3682,7 +3368,7 @@
           <w:color w:val="000000"/>
           <w:sz w:val="24"/>
         </w:rPr>
-        <w:t>Рис. 1.3. Часть конфигурационного файла.</w:t>
+        <w:t>Рис. 1.2. Содержимое дистрибутива.</w:t>
       </w:r>
     </w:p>
     <w:p>
@@ -3690,119 +3376,241 @@
         <w:pStyle w:val="a3"/>
       </w:pPr>
       <w:r>
-        <w:t xml:space="preserve">На рис. 1.3. </w:t>
-      </w:r>
-      <w:r>
-        <w:t xml:space="preserve">видно какие параметры можно изменять при создании запроса к требуемому ресурсу. </w:t>
+        <w:lastRenderedPageBreak/>
+        <w:t>Дистрибутив до выполнения скриптов состоит из 5 директорий:</w:t>
       </w:r>
     </w:p>
     <w:p>
       <w:pPr>
         <w:pStyle w:val="a3"/>
-        <w:rPr>
-          <w:i/>
-          <w:iCs/>
-        </w:rPr>
-      </w:pPr>
-      <w:r>
-        <w:t xml:space="preserve">Запустим скрипт </w:t>
-      </w:r>
-      <w:r>
-        <w:rPr>
-          <w:i/>
-          <w:iCs/>
+        <w:numPr>
+          <w:ilvl w:val="0"/>
+          <w:numId w:val="3"/>
+        </w:numPr>
+      </w:pPr>
+      <w:r>
+        <w:rPr>
           <w:lang w:val="en-US"/>
         </w:rPr>
-        <w:t>run</w:t>
-      </w:r>
-      <w:r>
-        <w:rPr>
-          <w:i/>
-          <w:iCs/>
-        </w:rPr>
-        <w:t>-</w:t>
+        <w:t xml:space="preserve">bin – </w:t>
+      </w:r>
+      <w:r>
+        <w:t xml:space="preserve">директория со </w:t>
+      </w:r>
+      <w:proofErr w:type="gramStart"/>
+      <w:r>
+        <w:t>скриптами</w:t>
+      </w:r>
+      <w:r>
+        <w:rPr>
+          <w:lang w:val="en-US"/>
+        </w:rPr>
+        <w:t>;</w:t>
+      </w:r>
+      <w:proofErr w:type="gramEnd"/>
+    </w:p>
+    <w:p>
+      <w:pPr>
+        <w:pStyle w:val="a3"/>
+        <w:numPr>
+          <w:ilvl w:val="0"/>
+          <w:numId w:val="3"/>
+        </w:numPr>
+      </w:pPr>
+      <w:r>
+        <w:rPr>
+          <w:lang w:val="en-US"/>
+        </w:rPr>
+        <w:t>config</w:t>
+      </w:r>
+      <w:r>
+        <w:t xml:space="preserve"> – </w:t>
+      </w:r>
+      <w:r>
+        <w:t xml:space="preserve">директория с конфигурационными </w:t>
+      </w:r>
+      <w:proofErr w:type="gramStart"/>
+      <w:r>
+        <w:t>файлами</w:t>
+      </w:r>
+      <w:r>
+        <w:t>;</w:t>
+      </w:r>
+      <w:proofErr w:type="gramEnd"/>
+    </w:p>
+    <w:p>
+      <w:pPr>
+        <w:pStyle w:val="a3"/>
+        <w:numPr>
+          <w:ilvl w:val="0"/>
+          <w:numId w:val="3"/>
+        </w:numPr>
+      </w:pPr>
+      <w:r>
+        <w:rPr>
+          <w:lang w:val="en-US"/>
+        </w:rPr>
+        <w:t>docs</w:t>
+      </w:r>
+      <w:r>
+        <w:t xml:space="preserve"> – </w:t>
+      </w:r>
+      <w:r>
+        <w:t>директория</w:t>
+      </w:r>
+      <w:r>
+        <w:t xml:space="preserve"> </w:t>
+      </w:r>
+      <w:r>
+        <w:t xml:space="preserve">с документацией </w:t>
+      </w:r>
+      <w:proofErr w:type="gramStart"/>
+      <w:r>
+        <w:rPr>
+          <w:lang w:val="en-US"/>
+        </w:rPr>
+        <w:t>Kafka</w:t>
+      </w:r>
+      <w:r>
+        <w:t>;</w:t>
+      </w:r>
+      <w:proofErr w:type="gramEnd"/>
+    </w:p>
+    <w:p>
+      <w:pPr>
+        <w:pStyle w:val="a3"/>
+        <w:numPr>
+          <w:ilvl w:val="0"/>
+          <w:numId w:val="3"/>
+        </w:numPr>
+      </w:pPr>
+      <w:r>
+        <w:rPr>
+          <w:lang w:val="en-US"/>
+        </w:rPr>
+        <w:t>lib</w:t>
+      </w:r>
+      <w:r>
+        <w:t xml:space="preserve"> – </w:t>
+      </w:r>
+      <w:r>
+        <w:t xml:space="preserve">директория с используемыми библиотеками в проекте в формате </w:t>
+      </w:r>
+      <w:r>
+        <w:t>.</w:t>
+      </w:r>
+      <w:proofErr w:type="gramStart"/>
+      <w:r>
+        <w:rPr>
+          <w:lang w:val="en-US"/>
+        </w:rPr>
+        <w:t>jar</w:t>
+      </w:r>
+      <w:r>
+        <w:t>;</w:t>
+      </w:r>
+      <w:proofErr w:type="gramEnd"/>
+    </w:p>
+    <w:p>
+      <w:pPr>
+        <w:pStyle w:val="a3"/>
+        <w:numPr>
+          <w:ilvl w:val="0"/>
+          <w:numId w:val="3"/>
+        </w:numPr>
+      </w:pPr>
+      <w:r>
+        <w:rPr>
+          <w:lang w:val="en-US"/>
+        </w:rPr>
+        <w:t>rules</w:t>
+      </w:r>
+      <w:r>
+        <w:t xml:space="preserve"> – </w:t>
+      </w:r>
+      <w:r>
+        <w:t xml:space="preserve">директория с правилами на языке </w:t>
+      </w:r>
+      <w:r>
+        <w:rPr>
+          <w:lang w:val="en-US"/>
+        </w:rPr>
+        <w:t>Drools</w:t>
+      </w:r>
+      <w:r>
+        <w:t>.</w:t>
+      </w:r>
+    </w:p>
+    <w:p>
+      <w:pPr>
+        <w:pStyle w:val="a3"/>
+      </w:pPr>
+      <w:r>
+        <w:t xml:space="preserve">Откроем файл конфигурации </w:t>
+      </w:r>
+      <w:r>
+        <w:rPr>
+          <w:lang w:val="en-US"/>
+        </w:rPr>
+        <w:t>config</w:t>
+      </w:r>
+      <w:r>
+        <w:t>/</w:t>
+      </w:r>
+      <w:r>
+        <w:rPr>
+          <w:lang w:val="en-US"/>
+        </w:rPr>
+        <w:t>configuration</w:t>
+      </w:r>
+      <w:r>
+        <w:t>.</w:t>
       </w:r>
       <w:proofErr w:type="spellStart"/>
       <w:r>
         <w:rPr>
-          <w:i/>
-          <w:iCs/>
           <w:lang w:val="en-US"/>
         </w:rPr>
-        <w:t>ui</w:t>
+        <w:t>yml</w:t>
       </w:r>
       <w:proofErr w:type="spellEnd"/>
       <w:r>
-        <w:rPr>
-          <w:i/>
-          <w:iCs/>
-        </w:rPr>
-        <w:t>.</w:t>
-      </w:r>
-      <w:r>
-        <w:rPr>
-          <w:i/>
-          <w:iCs/>
-          <w:lang w:val="en-US"/>
-        </w:rPr>
-        <w:t>bat</w:t>
-      </w:r>
-      <w:r>
-        <w:t xml:space="preserve"> </w:t>
-      </w:r>
-      <w:r>
-        <w:t xml:space="preserve">из директории </w:t>
-      </w:r>
-      <w:r>
-        <w:rPr>
-          <w:i/>
-          <w:iCs/>
-          <w:lang w:val="en-US"/>
-        </w:rPr>
-        <w:t>bin</w:t>
-      </w:r>
-      <w:r>
-        <w:rPr>
-          <w:i/>
-          <w:iCs/>
-        </w:rPr>
+        <w:t xml:space="preserve"> и просмотрим строки </w:t>
+      </w:r>
+      <w:proofErr w:type="gramStart"/>
+      <w:r>
+        <w:t>1-28</w:t>
+      </w:r>
+      <w:proofErr w:type="gramEnd"/>
+      <w:r>
         <w:t>:</w:t>
       </w:r>
     </w:p>
     <w:p>
       <w:pPr>
         <w:pStyle w:val="a3"/>
+        <w:spacing w:before="160" w:after="60"/>
         <w:ind w:firstLine="0"/>
         <w:jc w:val="center"/>
       </w:pPr>
-      <w:r>
-        <w:rPr>
-          <w:noProof/>
-          <w14:ligatures w14:val="standardContextual"/>
-        </w:rPr>
+      <w:r/>
+      <w:r>
         <w:drawing>
-          <wp:inline distT="0" distB="0" distL="0" distR="0" wp14:anchorId="543B1B8A" wp14:editId="43ED32B0">
-            <wp:extent cx="3764605" cy="1369898"/>
-            <wp:effectExtent l="0" t="0" r="0" b="1905"/>
-            <wp:docPr id="635409535" name="Рисунок 3" descr="Изображение выглядит как текст, снимок экрана, Шрифт, число&#10;&#10;Автоматически созданное описание"/>
+          <wp:inline xmlns:a="http://schemas.openxmlformats.org/drawingml/2006/main" xmlns:pic="http://schemas.openxmlformats.org/drawingml/2006/picture">
+            <wp:extent cx="4997734" cy="4140000"/>
+            <wp:docPr id="1845347442" name="Picture 1845347442"/>
             <wp:cNvGraphicFramePr>
-              <a:graphicFrameLocks xmlns:a="http://schemas.openxmlformats.org/drawingml/2006/main" noChangeAspect="1"/>
+              <a:graphicFrameLocks noChangeAspect="1"/>
             </wp:cNvGraphicFramePr>
-            <a:graphic xmlns:a="http://schemas.openxmlformats.org/drawingml/2006/main">
+            <a:graphic>
               <a:graphicData uri="http://schemas.openxmlformats.org/drawingml/2006/picture">
-                <pic:pic xmlns:pic="http://schemas.openxmlformats.org/drawingml/2006/picture">
+                <pic:pic>
                   <pic:nvPicPr>
-                    <pic:cNvPr id="635409535" name="Рисунок 3" descr="Изображение выглядит как текст, снимок экрана, Шрифт, число&#10;&#10;Автоматически созданное описание"/>
+                    <pic:cNvPr id="0" name="Снимок экрана 2026-10-25 180359.png"/>
                     <pic:cNvPicPr/>
                   </pic:nvPicPr>
                   <pic:blipFill>
-                    <a:blip r:embed="rId9">
-                      <a:extLst>
-                        <a:ext uri="{28A0092B-C50C-407E-A947-70E740481C1C}">
-                          <a14:useLocalDpi xmlns:a14="http://schemas.microsoft.com/office/drawing/2010/main" val="0"/>
-                        </a:ext>
-                      </a:extLst>
-                    </a:blip>
+                    <a:blip r:embed="rId25"/>
                     <a:stretch>
                       <a:fillRect/>
                     </a:stretch>
@@ -3810,11 +3618,9 @@
                   <pic:spPr>
                     <a:xfrm>
                       <a:off x="0" y="0"/>
-                      <a:ext cx="3778147" cy="1374826"/>
+                      <a:ext cx="4997734" cy="4140000"/>
                     </a:xfrm>
-                    <a:prstGeom prst="rect">
-                      <a:avLst/>
-                    </a:prstGeom>
+                    <a:prstGeom prst="rect"/>
                   </pic:spPr>
                 </pic:pic>
               </a:graphicData>
@@ -3836,7 +3642,7 @@
           <w:color w:val="000000"/>
           <w:sz w:val="24"/>
         </w:rPr>
-        <w:t>Рис. 1.4. Окно приложения iResolver.</w:t>
+        <w:t>Рис. 1.3. Часть конфигурационного файла.</w:t>
       </w:r>
     </w:p>
     <w:p>
@@ -3844,193 +3650,110 @@
         <w:pStyle w:val="a3"/>
       </w:pPr>
       <w:r>
-        <w:lastRenderedPageBreak/>
-        <w:t xml:space="preserve">В интерфейсе приложения предлагается: </w:t>
+        <w:t xml:space="preserve">На рис. 1.3. </w:t>
+      </w:r>
+      <w:r>
+        <w:t xml:space="preserve">видно какие параметры можно изменять при создании запроса к требуемому ресурсу. </w:t>
       </w:r>
     </w:p>
     <w:p>
       <w:pPr>
         <w:pStyle w:val="a3"/>
-        <w:numPr>
-          <w:ilvl w:val="0"/>
-          <w:numId w:val="4"/>
-        </w:numPr>
-      </w:pPr>
-      <w:r>
-        <w:t>создать дата-сет с разрешенными задачами;</w:t>
+        <w:rPr>
+          <w:i/>
+          <w:iCs/>
+        </w:rPr>
+      </w:pPr>
+      <w:r>
+        <w:t xml:space="preserve">Запустим скрипт </w:t>
+      </w:r>
+      <w:r>
+        <w:rPr>
+          <w:i/>
+          <w:iCs/>
+          <w:lang w:val="en-US"/>
+        </w:rPr>
+        <w:t>run</w:t>
+      </w:r>
+      <w:r>
+        <w:rPr>
+          <w:i/>
+          <w:iCs/>
+        </w:rPr>
+        <w:t>-</w:t>
+      </w:r>
+      <w:proofErr w:type="spellStart"/>
+      <w:r>
+        <w:rPr>
+          <w:i/>
+          <w:iCs/>
+          <w:lang w:val="en-US"/>
+        </w:rPr>
+        <w:t>ui</w:t>
+      </w:r>
+      <w:proofErr w:type="spellEnd"/>
+      <w:r>
+        <w:rPr>
+          <w:i/>
+          <w:iCs/>
+        </w:rPr>
+        <w:t>.</w:t>
+      </w:r>
+      <w:r>
+        <w:rPr>
+          <w:i/>
+          <w:iCs/>
+          <w:lang w:val="en-US"/>
+        </w:rPr>
+        <w:t>bat</w:t>
+      </w:r>
+      <w:r>
+        <w:t xml:space="preserve"> </w:t>
+      </w:r>
+      <w:r>
+        <w:t xml:space="preserve">из директории </w:t>
+      </w:r>
+      <w:r>
+        <w:rPr>
+          <w:i/>
+          <w:iCs/>
+          <w:lang w:val="en-US"/>
+        </w:rPr>
+        <w:t>bin</w:t>
+      </w:r>
+      <w:r>
+        <w:rPr>
+          <w:i/>
+          <w:iCs/>
+        </w:rPr>
+        <w:t>:</w:t>
       </w:r>
     </w:p>
     <w:p>
       <w:pPr>
         <w:pStyle w:val="a3"/>
-        <w:numPr>
-          <w:ilvl w:val="0"/>
-          <w:numId w:val="4"/>
-        </w:numPr>
-      </w:pPr>
-      <w:r>
-        <w:t xml:space="preserve">создать doc2vec </w:t>
-      </w:r>
-      <w:r>
-        <w:t>модель,</w:t>
-      </w:r>
-      <w:r>
-        <w:t xml:space="preserve"> базирующуюся на дата-сете задач;</w:t>
-      </w:r>
-    </w:p>
-    <w:p>
-      <w:pPr>
-        <w:pStyle w:val="a3"/>
-        <w:numPr>
-          <w:ilvl w:val="0"/>
-          <w:numId w:val="4"/>
-        </w:numPr>
-      </w:pPr>
-      <w:r>
-        <w:t>создать дата-сет контента документацией по проекту;</w:t>
-      </w:r>
-    </w:p>
-    <w:p>
-      <w:pPr>
-        <w:pStyle w:val="a3"/>
-        <w:numPr>
-          <w:ilvl w:val="0"/>
-          <w:numId w:val="4"/>
-        </w:numPr>
-      </w:pPr>
-      <w:r>
-        <w:t xml:space="preserve">создать doc2vec </w:t>
-      </w:r>
-      <w:r>
-        <w:t>модель,</w:t>
-      </w:r>
-      <w:r>
-        <w:t xml:space="preserve"> базирующуюся на дата-сете</w:t>
-      </w:r>
-      <w:r>
-        <w:t xml:space="preserve"> </w:t>
-      </w:r>
-      <w:r>
-        <w:t>документаций;</w:t>
-      </w:r>
-    </w:p>
-    <w:p>
-      <w:pPr>
-        <w:pStyle w:val="a3"/>
-        <w:numPr>
-          <w:ilvl w:val="0"/>
-          <w:numId w:val="4"/>
-        </w:numPr>
-      </w:pPr>
-      <w:r>
-        <w:t xml:space="preserve">создать дата-сет с контентом Apache </w:t>
-      </w:r>
-      <w:proofErr w:type="spellStart"/>
-      <w:r>
-        <w:t>Confluence</w:t>
-      </w:r>
-      <w:proofErr w:type="spellEnd"/>
-      <w:r>
-        <w:t>;</w:t>
-      </w:r>
-    </w:p>
-    <w:p>
-      <w:pPr>
-        <w:pStyle w:val="a3"/>
-        <w:numPr>
-          <w:ilvl w:val="0"/>
-          <w:numId w:val="4"/>
-        </w:numPr>
-      </w:pPr>
-      <w:r>
-        <w:t xml:space="preserve">создать doc2vec </w:t>
-      </w:r>
-      <w:r>
-        <w:t>модель,</w:t>
-      </w:r>
-      <w:r>
-        <w:t xml:space="preserve"> базирующуюся на дата-сете </w:t>
-      </w:r>
-      <w:proofErr w:type="spellStart"/>
-      <w:r>
-        <w:t>Confluence</w:t>
-      </w:r>
-      <w:proofErr w:type="spellEnd"/>
-      <w:r>
-        <w:t>;</w:t>
-      </w:r>
-    </w:p>
-    <w:p>
-      <w:pPr>
-        <w:pStyle w:val="a3"/>
-        <w:numPr>
-          <w:ilvl w:val="0"/>
-          <w:numId w:val="4"/>
-        </w:numPr>
-      </w:pPr>
-      <w:r>
-        <w:t>запустить программу</w:t>
-      </w:r>
-      <w:r>
-        <w:rPr>
-          <w:lang w:val="en-US"/>
-        </w:rPr>
-        <w:t>;</w:t>
-      </w:r>
-    </w:p>
-    <w:p>
-      <w:pPr>
-        <w:pStyle w:val="a3"/>
-        <w:numPr>
-          <w:ilvl w:val="0"/>
-          <w:numId w:val="4"/>
-        </w:numPr>
-      </w:pPr>
-      <w:r>
-        <w:t>вывести поля.</w:t>
-      </w:r>
-    </w:p>
-    <w:p>
-      <w:pPr>
-        <w:pStyle w:val="a3"/>
-      </w:pPr>
-      <w:r>
-        <w:t>По очереди выполним эти задачи и нажмем на кнопку «</w:t>
-      </w:r>
-      <w:r>
-        <w:rPr>
-          <w:lang w:val="en-US"/>
-        </w:rPr>
-        <w:t>Run</w:t>
-      </w:r>
-      <w:r>
-        <w:t xml:space="preserve">», после чего сгенерируется отчет по заданным правилам. </w:t>
-      </w:r>
-    </w:p>
-    <w:p>
-      <w:pPr>
-        <w:pStyle w:val="a3"/>
+        <w:spacing w:before="160" w:after="60"/>
         <w:ind w:firstLine="0"/>
         <w:jc w:val="center"/>
       </w:pPr>
+      <w:r/>
       <w:r>
         <w:drawing>
-          <wp:inline distT="0" distB="0" distL="0" distR="0" wp14:anchorId="40B7995F" wp14:editId="22280AC2">
-            <wp:extent cx="4148853" cy="4591456"/>
-            <wp:effectExtent l="0" t="0" r="4445" b="0"/>
-            <wp:docPr id="1316713526" name="Рисунок 1" descr="Изображение выглядит как текст, снимок экрана, Шрифт&#10;&#10;Автоматически созданное описание"/>
+          <wp:inline xmlns:a="http://schemas.openxmlformats.org/drawingml/2006/main" xmlns:pic="http://schemas.openxmlformats.org/drawingml/2006/picture">
+            <wp:extent cx="5760000" cy="3054488"/>
+            <wp:docPr id="1845347443" name="Picture 1845347443"/>
             <wp:cNvGraphicFramePr>
-              <a:graphicFrameLocks xmlns:a="http://schemas.openxmlformats.org/drawingml/2006/main" noChangeAspect="1"/>
+              <a:graphicFrameLocks noChangeAspect="1"/>
             </wp:cNvGraphicFramePr>
-            <a:graphic xmlns:a="http://schemas.openxmlformats.org/drawingml/2006/main">
+            <a:graphic>
               <a:graphicData uri="http://schemas.openxmlformats.org/drawingml/2006/picture">
-                <pic:pic xmlns:pic="http://schemas.openxmlformats.org/drawingml/2006/picture">
+                <pic:pic>
                   <pic:nvPicPr>
-                    <pic:cNvPr id="1316713526" name="Рисунок 1" descr="Изображение выглядит как текст, снимок экрана, Шрифт&#10;&#10;Автоматически созданное описание"/>
+                    <pic:cNvPr id="0" name="Снимок экрана 2026-10-25 180512.png"/>
                     <pic:cNvPicPr/>
                   </pic:nvPicPr>
                   <pic:blipFill>
-                    <a:blip r:embed="rId10"/>
+                    <a:blip r:embed="rId26"/>
                     <a:stretch>
                       <a:fillRect/>
                     </a:stretch>
@@ -4038,11 +3761,9 @@
                   <pic:spPr>
                     <a:xfrm>
                       <a:off x="0" y="0"/>
-                      <a:ext cx="4211501" cy="4660787"/>
+                      <a:ext cx="5760000" cy="3054488"/>
                     </a:xfrm>
-                    <a:prstGeom prst="rect">
-                      <a:avLst/>
-                    </a:prstGeom>
+                    <a:prstGeom prst="rect"/>
                   </pic:spPr>
                 </pic:pic>
               </a:graphicData>
@@ -4064,33 +3785,202 @@
           <w:color w:val="000000"/>
           <w:sz w:val="24"/>
         </w:rPr>
-        <w:t>Рис. 1.5. Сгенерированный отчет.</w:t>
-      </w:r>
-    </w:p>
-    <w:p>
-      <w:pPr>
-        <w:spacing w:line="360" w:lineRule="auto"/>
+        <w:t>Рис. 1.4. Окно приложения iResolver.</w:t>
+      </w:r>
+    </w:p>
+    <w:p>
+      <w:pPr>
+        <w:pStyle w:val="a3"/>
+      </w:pPr>
+      <w:r>
+        <w:lastRenderedPageBreak/>
+        <w:t xml:space="preserve">В интерфейсе приложения предлагается: </w:t>
+      </w:r>
+    </w:p>
+    <w:p>
+      <w:pPr>
+        <w:pStyle w:val="a3"/>
+        <w:numPr>
+          <w:ilvl w:val="0"/>
+          <w:numId w:val="4"/>
+        </w:numPr>
+      </w:pPr>
+      <w:r>
+        <w:t>создать дата-сет с разрешенными задачами;</w:t>
+      </w:r>
+    </w:p>
+    <w:p>
+      <w:pPr>
+        <w:pStyle w:val="a3"/>
+        <w:numPr>
+          <w:ilvl w:val="0"/>
+          <w:numId w:val="4"/>
+        </w:numPr>
+      </w:pPr>
+      <w:r>
+        <w:t xml:space="preserve">создать doc2vec </w:t>
+      </w:r>
+      <w:r>
+        <w:t>модель,</w:t>
+      </w:r>
+      <w:r>
+        <w:t xml:space="preserve"> базирующуюся на дата-сете задач;</w:t>
+      </w:r>
+    </w:p>
+    <w:p>
+      <w:pPr>
+        <w:pStyle w:val="a3"/>
+        <w:numPr>
+          <w:ilvl w:val="0"/>
+          <w:numId w:val="4"/>
+        </w:numPr>
+      </w:pPr>
+      <w:r>
+        <w:t>создать дата-сет контента документацией по проекту;</w:t>
+      </w:r>
+    </w:p>
+    <w:p>
+      <w:pPr>
+        <w:pStyle w:val="a3"/>
+        <w:numPr>
+          <w:ilvl w:val="0"/>
+          <w:numId w:val="4"/>
+        </w:numPr>
+      </w:pPr>
+      <w:r>
+        <w:t xml:space="preserve">создать doc2vec </w:t>
+      </w:r>
+      <w:r>
+        <w:t>модель,</w:t>
+      </w:r>
+      <w:r>
+        <w:t xml:space="preserve"> базирующуюся на дата-сете</w:t>
+      </w:r>
+      <w:r>
+        <w:t xml:space="preserve"> </w:t>
+      </w:r>
+      <w:r>
+        <w:t>документаций;</w:t>
+      </w:r>
+    </w:p>
+    <w:p>
+      <w:pPr>
+        <w:pStyle w:val="a3"/>
+        <w:numPr>
+          <w:ilvl w:val="0"/>
+          <w:numId w:val="4"/>
+        </w:numPr>
+      </w:pPr>
+      <w:r>
+        <w:t xml:space="preserve">создать дата-сет с контентом Apache </w:t>
+      </w:r>
+      <w:proofErr w:type="spellStart"/>
+      <w:r>
+        <w:t>Confluence</w:t>
+      </w:r>
+      <w:proofErr w:type="spellEnd"/>
+      <w:r>
+        <w:t>;</w:t>
+      </w:r>
+    </w:p>
+    <w:p>
+      <w:pPr>
+        <w:pStyle w:val="a3"/>
+        <w:numPr>
+          <w:ilvl w:val="0"/>
+          <w:numId w:val="4"/>
+        </w:numPr>
+      </w:pPr>
+      <w:r>
+        <w:t xml:space="preserve">создать doc2vec </w:t>
+      </w:r>
+      <w:r>
+        <w:t>модель,</w:t>
+      </w:r>
+      <w:r>
+        <w:t xml:space="preserve"> базирующуюся на дата-сете </w:t>
+      </w:r>
+      <w:proofErr w:type="spellStart"/>
+      <w:r>
+        <w:t>Confluence</w:t>
+      </w:r>
+      <w:proofErr w:type="spellEnd"/>
+      <w:r>
+        <w:t>;</w:t>
+      </w:r>
+    </w:p>
+    <w:p>
+      <w:pPr>
+        <w:pStyle w:val="a3"/>
+        <w:numPr>
+          <w:ilvl w:val="0"/>
+          <w:numId w:val="4"/>
+        </w:numPr>
+      </w:pPr>
+      <w:r>
+        <w:t>запустить программу</w:t>
+      </w:r>
+      <w:r>
+        <w:rPr>
+          <w:lang w:val="en-US"/>
+        </w:rPr>
+        <w:t>;</w:t>
+      </w:r>
+    </w:p>
+    <w:p>
+      <w:pPr>
+        <w:pStyle w:val="a3"/>
+        <w:numPr>
+          <w:ilvl w:val="0"/>
+          <w:numId w:val="4"/>
+        </w:numPr>
+      </w:pPr>
+      <w:r>
+        <w:t>вывести поля.</w:t>
+      </w:r>
+    </w:p>
+    <w:p>
+      <w:pPr>
+        <w:pStyle w:val="a3"/>
+      </w:pPr>
+      <w:r>
+        <w:t>По очереди выполним эти задачи и нажмем на кнопку «</w:t>
+      </w:r>
+      <w:r>
+        <w:rPr>
+          <w:lang w:val="en-US"/>
+        </w:rPr>
+        <w:t>Run</w:t>
+      </w:r>
+      <w:r>
+        <w:t xml:space="preserve">», после чего сгенерируется отчет по заданным правилам. </w:t>
+      </w:r>
+    </w:p>
+    <w:p>
+      <w:pPr>
+        <w:pStyle w:val="a3"/>
+        <w:spacing w:before="160" w:after="60"/>
+        <w:ind w:firstLine="0"/>
         <w:jc w:val="center"/>
       </w:pPr>
-      <w:r>
-        <w:lastRenderedPageBreak/>
+      <w:r/>
+      <w:r>
         <w:drawing>
-          <wp:inline distT="0" distB="0" distL="0" distR="0" wp14:anchorId="652FBFDD" wp14:editId="7C66B30C">
-            <wp:extent cx="5034017" cy="4143983"/>
-            <wp:effectExtent l="0" t="0" r="0" b="0"/>
-            <wp:docPr id="1111369733" name="Рисунок 1" descr="Изображение выглядит как текст, снимок экрана, число, Шрифт&#10;&#10;Автоматически созданное описание"/>
+          <wp:inline xmlns:a="http://schemas.openxmlformats.org/drawingml/2006/main" xmlns:pic="http://schemas.openxmlformats.org/drawingml/2006/picture">
+            <wp:extent cx="5760000" cy="2078853"/>
+            <wp:docPr id="1845347444" name="Picture 1845347444"/>
             <wp:cNvGraphicFramePr>
-              <a:graphicFrameLocks xmlns:a="http://schemas.openxmlformats.org/drawingml/2006/main" noChangeAspect="1"/>
+              <a:graphicFrameLocks noChangeAspect="1"/>
             </wp:cNvGraphicFramePr>
-            <a:graphic xmlns:a="http://schemas.openxmlformats.org/drawingml/2006/main">
+            <a:graphic>
               <a:graphicData uri="http://schemas.openxmlformats.org/drawingml/2006/picture">
-                <pic:pic xmlns:pic="http://schemas.openxmlformats.org/drawingml/2006/picture">
+                <pic:pic>
                   <pic:nvPicPr>
-                    <pic:cNvPr id="1111369733" name="Рисунок 1" descr="Изображение выглядит как текст, снимок экрана, число, Шрифт&#10;&#10;Автоматически созданное описание"/>
+                    <pic:cNvPr id="0" name="Снимок экрана 2026-10-25 180645.png"/>
                     <pic:cNvPicPr/>
                   </pic:nvPicPr>
                   <pic:blipFill>
-                    <a:blip r:embed="rId11"/>
+                    <a:blip r:embed="rId27"/>
                     <a:stretch>
                       <a:fillRect/>
                     </a:stretch>
@@ -4098,11 +3988,9 @@
                   <pic:spPr>
                     <a:xfrm>
                       <a:off x="0" y="0"/>
-                      <a:ext cx="5072640" cy="4175778"/>
+                      <a:ext cx="5760000" cy="2078853"/>
                     </a:xfrm>
-                    <a:prstGeom prst="rect">
-                      <a:avLst/>
-                    </a:prstGeom>
+                    <a:prstGeom prst="rect"/>
                   </pic:spPr>
                 </pic:pic>
               </a:graphicData>
@@ -4124,32 +4012,33 @@
           <w:color w:val="000000"/>
           <w:sz w:val="24"/>
         </w:rPr>
-        <w:t>Рис. 1.6. Раздел «Similar issues».</w:t>
-      </w:r>
-    </w:p>
-    <w:p>
-      <w:pPr>
-        <w:spacing w:line="360" w:lineRule="auto"/>
+        <w:t>Рис. 1.5. Сгенерированный отчет.</w:t>
+      </w:r>
+    </w:p>
+    <w:p>
+      <w:pPr>
+        <w:spacing w:line="360" w:lineRule="auto" w:before="160" w:after="60"/>
+        <w:ind w:firstLine="0"/>
         <w:jc w:val="center"/>
       </w:pPr>
+      <w:r/>
       <w:r>
         <w:drawing>
-          <wp:inline distT="0" distB="0" distL="0" distR="0" wp14:anchorId="14814B5F" wp14:editId="0D85275E">
-            <wp:extent cx="5034016" cy="4143983"/>
-            <wp:effectExtent l="0" t="0" r="0" b="0"/>
-            <wp:docPr id="430461456" name="Рисунок 1" descr="Изображение выглядит как текст, снимок экрана, число, Шрифт&#10;&#10;Автоматически созданное описание"/>
+          <wp:inline xmlns:a="http://schemas.openxmlformats.org/drawingml/2006/main" xmlns:pic="http://schemas.openxmlformats.org/drawingml/2006/picture">
+            <wp:extent cx="5760000" cy="3203536"/>
+            <wp:docPr id="1845347445" name="Picture 1845347445"/>
             <wp:cNvGraphicFramePr>
-              <a:graphicFrameLocks xmlns:a="http://schemas.openxmlformats.org/drawingml/2006/main" noChangeAspect="1"/>
+              <a:graphicFrameLocks noChangeAspect="1"/>
             </wp:cNvGraphicFramePr>
-            <a:graphic xmlns:a="http://schemas.openxmlformats.org/drawingml/2006/main">
+            <a:graphic>
               <a:graphicData uri="http://schemas.openxmlformats.org/drawingml/2006/picture">
-                <pic:pic xmlns:pic="http://schemas.openxmlformats.org/drawingml/2006/picture">
+                <pic:pic>
                   <pic:nvPicPr>
-                    <pic:cNvPr id="430461456" name="Рисунок 1" descr="Изображение выглядит как текст, снимок экрана, число, Шрифт&#10;&#10;Автоматически созданное описание"/>
+                    <pic:cNvPr id="0" name="Снимок экрана 2026-10-25 180748.png"/>
                     <pic:cNvPicPr/>
                   </pic:nvPicPr>
                   <pic:blipFill>
-                    <a:blip r:embed="rId12"/>
+                    <a:blip r:embed="rId28"/>
                     <a:stretch>
                       <a:fillRect/>
                     </a:stretch>
@@ -4157,11 +4046,9 @@
                   <pic:spPr>
                     <a:xfrm>
                       <a:off x="0" y="0"/>
-                      <a:ext cx="5084790" cy="4185780"/>
+                      <a:ext cx="5760000" cy="3203536"/>
                     </a:xfrm>
-                    <a:prstGeom prst="rect">
-                      <a:avLst/>
-                    </a:prstGeom>
+                    <a:prstGeom prst="rect"/>
                   </pic:spPr>
                 </pic:pic>
               </a:graphicData>
@@ -4183,439 +4070,33 @@
           <w:color w:val="000000"/>
           <w:sz w:val="24"/>
         </w:rPr>
-        <w:t>Рис. 1.7. Раздел «Qualified users».</w:t>
-      </w:r>
-    </w:p>
-    <w:bookmarkEnd w:id="12"/>
-    <w:p>
-      <w:pPr>
-        <w:spacing w:line="360" w:lineRule="auto"/>
+        <w:t>Рис. 1.6. Раздел «Similar issues».</w:t>
+      </w:r>
+    </w:p>
+    <w:p>
+      <w:pPr>
+        <w:spacing w:line="360" w:lineRule="auto" w:before="160" w:after="60"/>
+        <w:ind w:firstLine="0"/>
         <w:jc w:val="center"/>
       </w:pPr>
-      <w:r>
-        <w:lastRenderedPageBreak/>
+      <w:r/>
+      <w:r>
         <w:drawing>
-          <wp:inline distT="0" distB="0" distL="0" distR="0" wp14:anchorId="3BBE77B5" wp14:editId="5E42F7CB">
-            <wp:extent cx="5032335" cy="1293779"/>
-            <wp:effectExtent l="0" t="0" r="0" b="1905"/>
-            <wp:docPr id="702677220" name="Рисунок 1" descr="Изображение выглядит как текст, снимок экрана, число, программное обеспечение&#10;&#10;Автоматически созданное описание"/>
+          <wp:inline xmlns:a="http://schemas.openxmlformats.org/drawingml/2006/main" xmlns:pic="http://schemas.openxmlformats.org/drawingml/2006/picture">
+            <wp:extent cx="5760000" cy="3573529"/>
+            <wp:docPr id="1845347446" name="Picture 1845347446"/>
             <wp:cNvGraphicFramePr>
-              <a:graphicFrameLocks xmlns:a="http://schemas.openxmlformats.org/drawingml/2006/main" noChangeAspect="1"/>
+              <a:graphicFrameLocks noChangeAspect="1"/>
             </wp:cNvGraphicFramePr>
-            <a:graphic xmlns:a="http://schemas.openxmlformats.org/drawingml/2006/main">
+            <a:graphic>
               <a:graphicData uri="http://schemas.openxmlformats.org/drawingml/2006/picture">
-                <pic:pic xmlns:pic="http://schemas.openxmlformats.org/drawingml/2006/picture">
+                <pic:pic>
                   <pic:nvPicPr>
-                    <pic:cNvPr id="702677220" name="Рисунок 1" descr="Изображение выглядит как текст, снимок экрана, число, программное обеспечение&#10;&#10;Автоматически созданное описание"/>
-                    <pic:cNvPicPr/>
-                  </pic:nvPicPr>
-                  <pic:blipFill rotWithShape="1">
-                    <a:blip r:embed="rId13"/>
-                    <a:srcRect b="68769"/>
-                    <a:stretch/>
-                  </pic:blipFill>
-                  <pic:spPr bwMode="auto">
-                    <a:xfrm>
-                      <a:off x="0" y="0"/>
-                      <a:ext cx="5309521" cy="1365042"/>
-                    </a:xfrm>
-                    <a:prstGeom prst="rect">
-                      <a:avLst/>
-                    </a:prstGeom>
-                    <a:ln>
-                      <a:noFill/>
-                    </a:ln>
-                    <a:extLst>
-                      <a:ext uri="{53640926-AAD7-44D8-BBD7-CCE9431645EC}">
-                        <a14:shadowObscured xmlns:a14="http://schemas.microsoft.com/office/drawing/2010/main"/>
-                      </a:ext>
-                    </a:extLst>
-                  </pic:spPr>
-                </pic:pic>
-              </a:graphicData>
-            </a:graphic>
-          </wp:inline>
-        </w:drawing>
-      </w:r>
-    </w:p>
-    <w:p>
-      <w:pPr>
-        <w:pStyle w:val="af1"/>
-        <w:jc w:val="center"/>
-        <w:rPr>
-          <w:lang w:val="en-US"/>
-        </w:rPr>
-      </w:pPr>
-      <w:r>
-        <w:rPr>
-          <w:rFonts w:ascii="Times New Roman" w:hAnsi="Times New Roman"/>
-          <w:b w:val="0"/>
-          <w:i/>
-          <w:color w:val="000000"/>
-          <w:sz w:val="24"/>
-        </w:rPr>
-        <w:t>Рис. 1.8. Раздел «Probable labels».</w:t>
-      </w:r>
-    </w:p>
-    <w:p>
-      <w:pPr>
-        <w:spacing w:line="360" w:lineRule="auto"/>
-        <w:jc w:val="center"/>
-        <w:rPr>
-          <w:lang w:val="en-US"/>
-        </w:rPr>
-      </w:pPr>
-      <w:r>
-        <w:rPr>
-          <w:lang w:val="en-US"/>
-        </w:rPr>
-        <w:drawing>
-          <wp:inline distT="0" distB="0" distL="0" distR="0" wp14:anchorId="0BF16649" wp14:editId="247304AB">
-            <wp:extent cx="5030660" cy="535521"/>
-            <wp:effectExtent l="0" t="0" r="0" b="0"/>
-            <wp:docPr id="553164823" name="Рисунок 1" descr="Изображение выглядит как текст, снимок экрана, число, Шрифт&#10;&#10;Автоматически созданное описание"/>
-            <wp:cNvGraphicFramePr>
-              <a:graphicFrameLocks xmlns:a="http://schemas.openxmlformats.org/drawingml/2006/main" noChangeAspect="1"/>
-            </wp:cNvGraphicFramePr>
-            <a:graphic xmlns:a="http://schemas.openxmlformats.org/drawingml/2006/main">
-              <a:graphicData uri="http://schemas.openxmlformats.org/drawingml/2006/picture">
-                <pic:pic xmlns:pic="http://schemas.openxmlformats.org/drawingml/2006/picture">
-                  <pic:nvPicPr>
-                    <pic:cNvPr id="553164823" name="Рисунок 1" descr="Изображение выглядит как текст, снимок экрана, число, Шрифт&#10;&#10;Автоматически созданное описание"/>
-                    <pic:cNvPicPr/>
-                  </pic:nvPicPr>
-                  <pic:blipFill rotWithShape="1">
-                    <a:blip r:embed="rId14"/>
-                    <a:srcRect t="6365" b="80703"/>
-                    <a:stretch/>
-                  </pic:blipFill>
-                  <pic:spPr bwMode="auto">
-                    <a:xfrm>
-                      <a:off x="0" y="0"/>
-                      <a:ext cx="5267850" cy="560770"/>
-                    </a:xfrm>
-                    <a:prstGeom prst="rect">
-                      <a:avLst/>
-                    </a:prstGeom>
-                    <a:ln>
-                      <a:noFill/>
-                    </a:ln>
-                    <a:extLst>
-                      <a:ext uri="{53640926-AAD7-44D8-BBD7-CCE9431645EC}">
-                        <a14:shadowObscured xmlns:a14="http://schemas.microsoft.com/office/drawing/2010/main"/>
-                      </a:ext>
-                    </a:extLst>
-                  </pic:spPr>
-                </pic:pic>
-              </a:graphicData>
-            </a:graphic>
-          </wp:inline>
-        </w:drawing>
-      </w:r>
-    </w:p>
-    <w:p>
-      <w:pPr>
-        <w:pStyle w:val="af1"/>
-        <w:jc w:val="center"/>
-        <w:rPr>
-          <w:lang w:val="en-US"/>
-        </w:rPr>
-      </w:pPr>
-      <w:r>
-        <w:rPr>
-          <w:rFonts w:ascii="Times New Roman" w:hAnsi="Times New Roman"/>
-          <w:b w:val="0"/>
-          <w:i/>
-          <w:color w:val="000000"/>
-          <w:sz w:val="24"/>
-        </w:rPr>
-        <w:t>Рис. 1.9. Раздел «Probable attachments».</w:t>
-      </w:r>
-    </w:p>
-    <w:p>
-      <w:pPr>
-        <w:spacing w:line="360" w:lineRule="auto"/>
-        <w:jc w:val="center"/>
-        <w:rPr>
-          <w:lang w:val="en-US"/>
-        </w:rPr>
-      </w:pPr>
-      <w:r>
-        <w:rPr>
-          <w:lang w:val="en-US"/>
-        </w:rPr>
-        <w:drawing>
-          <wp:inline distT="0" distB="0" distL="0" distR="0" wp14:anchorId="281BD74F" wp14:editId="7B3209C6">
-            <wp:extent cx="5034363" cy="2217906"/>
-            <wp:effectExtent l="0" t="0" r="0" b="5080"/>
-            <wp:docPr id="1643764313" name="Рисунок 1" descr="Изображение выглядит как текст, снимок экрана, число, Шрифт&#10;&#10;Автоматически созданное описание"/>
-            <wp:cNvGraphicFramePr>
-              <a:graphicFrameLocks xmlns:a="http://schemas.openxmlformats.org/drawingml/2006/main" noChangeAspect="1"/>
-            </wp:cNvGraphicFramePr>
-            <a:graphic xmlns:a="http://schemas.openxmlformats.org/drawingml/2006/main">
-              <a:graphicData uri="http://schemas.openxmlformats.org/drawingml/2006/picture">
-                <pic:pic xmlns:pic="http://schemas.openxmlformats.org/drawingml/2006/picture">
-                  <pic:nvPicPr>
-                    <pic:cNvPr id="1643764313" name="Рисунок 1" descr="Изображение выглядит как текст, снимок экрана, число, Шрифт&#10;&#10;Автоматически созданное описание"/>
-                    <pic:cNvPicPr/>
-                  </pic:nvPicPr>
-                  <pic:blipFill rotWithShape="1">
-                    <a:blip r:embed="rId14"/>
-                    <a:srcRect t="24468" b="22015"/>
-                    <a:stretch/>
-                  </pic:blipFill>
-                  <pic:spPr bwMode="auto">
-                    <a:xfrm>
-                      <a:off x="0" y="0"/>
-                      <a:ext cx="5109115" cy="2250838"/>
-                    </a:xfrm>
-                    <a:prstGeom prst="rect">
-                      <a:avLst/>
-                    </a:prstGeom>
-                    <a:ln>
-                      <a:noFill/>
-                    </a:ln>
-                    <a:extLst>
-                      <a:ext uri="{53640926-AAD7-44D8-BBD7-CCE9431645EC}">
-                        <a14:shadowObscured xmlns:a14="http://schemas.microsoft.com/office/drawing/2010/main"/>
-                      </a:ext>
-                    </a:extLst>
-                  </pic:spPr>
-                </pic:pic>
-              </a:graphicData>
-            </a:graphic>
-          </wp:inline>
-        </w:drawing>
-      </w:r>
-    </w:p>
-    <w:p>
-      <w:pPr>
-        <w:pStyle w:val="af1"/>
-        <w:jc w:val="center"/>
-        <w:rPr>
-          <w:lang w:val="en-US"/>
-        </w:rPr>
-      </w:pPr>
-      <w:r>
-        <w:rPr>
-          <w:rFonts w:ascii="Times New Roman" w:hAnsi="Times New Roman"/>
-          <w:b w:val="0"/>
-          <w:i/>
-          <w:color w:val="000000"/>
-          <w:sz w:val="24"/>
-        </w:rPr>
-        <w:t>Рис. 1.10. Раздел «Useful Documentation».</w:t>
-      </w:r>
-    </w:p>
-    <w:p>
-      <w:pPr>
-        <w:spacing w:line="360" w:lineRule="auto"/>
-        <w:jc w:val="center"/>
-        <w:rPr>
-          <w:lang w:val="en-US"/>
-        </w:rPr>
-      </w:pPr>
-      <w:r>
-        <w:rPr>
-          <w:lang w:val="en-US"/>
-        </w:rPr>
-        <w:drawing>
-          <wp:inline distT="0" distB="0" distL="0" distR="0" wp14:anchorId="4278C355" wp14:editId="593CC709">
-            <wp:extent cx="5041425" cy="2237361"/>
-            <wp:effectExtent l="0" t="0" r="635" b="0"/>
-            <wp:docPr id="1378893472" name="Рисунок 1" descr="Изображение выглядит как текст, снимок экрана, число, Шрифт&#10;&#10;Автоматически созданное описание"/>
-            <wp:cNvGraphicFramePr>
-              <a:graphicFrameLocks xmlns:a="http://schemas.openxmlformats.org/drawingml/2006/main" noChangeAspect="1"/>
-            </wp:cNvGraphicFramePr>
-            <a:graphic xmlns:a="http://schemas.openxmlformats.org/drawingml/2006/main">
-              <a:graphicData uri="http://schemas.openxmlformats.org/drawingml/2006/picture">
-                <pic:pic xmlns:pic="http://schemas.openxmlformats.org/drawingml/2006/picture">
-                  <pic:nvPicPr>
-                    <pic:cNvPr id="1378893472" name="Рисунок 1" descr="Изображение выглядит как текст, снимок экрана, число, Шрифт&#10;&#10;Автоматически созданное описание"/>
-                    <pic:cNvPicPr/>
-                  </pic:nvPicPr>
-                  <pic:blipFill rotWithShape="1">
-                    <a:blip r:embed="rId15"/>
-                    <a:srcRect t="9747" b="36342"/>
-                    <a:stretch/>
-                  </pic:blipFill>
-                  <pic:spPr bwMode="auto">
-                    <a:xfrm>
-                      <a:off x="0" y="0"/>
-                      <a:ext cx="5112081" cy="2268718"/>
-                    </a:xfrm>
-                    <a:prstGeom prst="rect">
-                      <a:avLst/>
-                    </a:prstGeom>
-                    <a:ln>
-                      <a:noFill/>
-                    </a:ln>
-                    <a:extLst>
-                      <a:ext uri="{53640926-AAD7-44D8-BBD7-CCE9431645EC}">
-                        <a14:shadowObscured xmlns:a14="http://schemas.microsoft.com/office/drawing/2010/main"/>
-                      </a:ext>
-                    </a:extLst>
-                  </pic:spPr>
-                </pic:pic>
-              </a:graphicData>
-            </a:graphic>
-          </wp:inline>
-        </w:drawing>
-      </w:r>
-    </w:p>
-    <w:p>
-      <w:pPr>
-        <w:pStyle w:val="af1"/>
-        <w:jc w:val="center"/>
-        <w:rPr>
-          <w:lang w:val="en-US"/>
-        </w:rPr>
-      </w:pPr>
-      <w:r>
-        <w:rPr>
-          <w:rFonts w:ascii="Times New Roman" w:hAnsi="Times New Roman"/>
-          <w:b w:val="0"/>
-          <w:i/>
-          <w:color w:val="000000"/>
-          <w:sz w:val="24"/>
-        </w:rPr>
-        <w:t>Рис. 1.11. Раздел «Confluence pages».</w:t>
-      </w:r>
-    </w:p>
-    <w:p>
-      <w:pPr>
-        <w:spacing w:line="360" w:lineRule="auto"/>
-        <w:jc w:val="center"/>
-        <w:rPr>
-          <w:lang w:val="en-US"/>
-        </w:rPr>
-      </w:pPr>
-      <w:r>
-        <w:rPr>
-          <w:lang w:val="en-US"/>
-        </w:rPr>
-        <w:lastRenderedPageBreak/>
-        <w:drawing>
-          <wp:inline distT="0" distB="0" distL="0" distR="0" wp14:anchorId="450895FF" wp14:editId="4E6B2BA5">
-            <wp:extent cx="5033350" cy="865516"/>
-            <wp:effectExtent l="0" t="0" r="0" b="0"/>
-            <wp:docPr id="928899529" name="Рисунок 1" descr="Изображение выглядит как текст, снимок экрана, число, Шрифт&#10;&#10;Автоматически созданное описание"/>
-            <wp:cNvGraphicFramePr>
-              <a:graphicFrameLocks xmlns:a="http://schemas.openxmlformats.org/drawingml/2006/main" noChangeAspect="1"/>
-            </wp:cNvGraphicFramePr>
-            <a:graphic xmlns:a="http://schemas.openxmlformats.org/drawingml/2006/main">
-              <a:graphicData uri="http://schemas.openxmlformats.org/drawingml/2006/picture">
-                <pic:pic xmlns:pic="http://schemas.openxmlformats.org/drawingml/2006/picture">
-                  <pic:nvPicPr>
-                    <pic:cNvPr id="928899529" name="Рисунок 1" descr="Изображение выглядит как текст, снимок экрана, число, Шрифт&#10;&#10;Автоматически созданное описание"/>
-                    <pic:cNvPicPr/>
-                  </pic:nvPicPr>
-                  <pic:blipFill rotWithShape="1">
-                    <a:blip r:embed="rId15"/>
-                    <a:srcRect t="68430" b="10681"/>
-                    <a:stretch/>
-                  </pic:blipFill>
-                  <pic:spPr bwMode="auto">
-                    <a:xfrm>
-                      <a:off x="0" y="0"/>
-                      <a:ext cx="5144126" cy="884565"/>
-                    </a:xfrm>
-                    <a:prstGeom prst="rect">
-                      <a:avLst/>
-                    </a:prstGeom>
-                    <a:ln>
-                      <a:noFill/>
-                    </a:ln>
-                    <a:extLst>
-                      <a:ext uri="{53640926-AAD7-44D8-BBD7-CCE9431645EC}">
-                        <a14:shadowObscured xmlns:a14="http://schemas.microsoft.com/office/drawing/2010/main"/>
-                      </a:ext>
-                    </a:extLst>
-                  </pic:spPr>
-                </pic:pic>
-              </a:graphicData>
-            </a:graphic>
-          </wp:inline>
-        </w:drawing>
-      </w:r>
-    </w:p>
-    <w:p>
-      <w:pPr>
-        <w:pStyle w:val="af1"/>
-        <w:jc w:val="center"/>
-      </w:pPr>
-      <w:r>
-        <w:rPr>
-          <w:rFonts w:ascii="Times New Roman" w:hAnsi="Times New Roman"/>
-          <w:b w:val="0"/>
-          <w:i/>
-          <w:color w:val="000000"/>
-          <w:sz w:val="24"/>
-        </w:rPr>
-        <w:t>Рис. 1.12. Раздел «Proposals».</w:t>
-      </w:r>
-    </w:p>
-    <w:p>
-      <w:pPr>
-        <w:pStyle w:val="a3"/>
-      </w:pPr>
-      <w:r>
-        <w:t xml:space="preserve">Изменим </w:t>
-      </w:r>
-      <w:r>
-        <w:rPr>
-          <w:lang w:val="en-US"/>
-        </w:rPr>
-        <w:t>JQL</w:t>
-      </w:r>
-      <w:r>
-        <w:t xml:space="preserve"> </w:t>
-      </w:r>
-      <w:r>
-        <w:t xml:space="preserve">запрос и создадим новые правила на языке </w:t>
-      </w:r>
-      <w:r>
-        <w:rPr>
-          <w:lang w:val="en-US"/>
-        </w:rPr>
-        <w:t>Drool</w:t>
-      </w:r>
-      <w:r>
-        <w:t>.</w:t>
-      </w:r>
-    </w:p>
-    <w:p>
-      <w:pPr>
-        <w:spacing w:line="360" w:lineRule="auto"/>
-        <w:jc w:val="center"/>
-      </w:pPr>
-      <w:r>
-        <w:rPr>
-          <w:noProof/>
-        </w:rPr>
-        <w:drawing>
-          <wp:inline distT="0" distB="0" distL="0" distR="0" wp14:anchorId="79FDBE28" wp14:editId="34F367C4">
-            <wp:extent cx="4967659" cy="2517549"/>
-            <wp:effectExtent l="0" t="0" r="0" b="0"/>
-            <wp:docPr id="793189519" name="Рисунок 5" descr="Изображение выглядит как текст, снимок экрана&#10;&#10;Автоматически созданное описание"/>
-            <wp:cNvGraphicFramePr>
-              <a:graphicFrameLocks xmlns:a="http://schemas.openxmlformats.org/drawingml/2006/main" noChangeAspect="1"/>
-            </wp:cNvGraphicFramePr>
-            <a:graphic xmlns:a="http://schemas.openxmlformats.org/drawingml/2006/main">
-              <a:graphicData uri="http://schemas.openxmlformats.org/drawingml/2006/picture">
-                <pic:pic xmlns:pic="http://schemas.openxmlformats.org/drawingml/2006/picture">
-                  <pic:nvPicPr>
-                    <pic:cNvPr id="793189519" name="Рисунок 5" descr="Изображение выглядит как текст, снимок экрана&#10;&#10;Автоматически созданное описание"/>
+                    <pic:cNvPr id="0" name="Снимок экрана 2026-10-25 180838.png"/>
                     <pic:cNvPicPr/>
                   </pic:nvPicPr>
                   <pic:blipFill>
-                    <a:blip r:embed="rId16">
-                      <a:extLst>
-                        <a:ext uri="{28A0092B-C50C-407E-A947-70E740481C1C}">
-                          <a14:useLocalDpi xmlns:a14="http://schemas.microsoft.com/office/drawing/2010/main" val="0"/>
-                        </a:ext>
-                      </a:extLst>
-                    </a:blip>
+                    <a:blip r:embed="rId29"/>
                     <a:stretch>
                       <a:fillRect/>
                     </a:stretch>
@@ -4623,11 +4104,9 @@
                   <pic:spPr>
                     <a:xfrm>
                       <a:off x="0" y="0"/>
-                      <a:ext cx="5019764" cy="2543955"/>
+                      <a:ext cx="5760000" cy="3573529"/>
                     </a:xfrm>
-                    <a:prstGeom prst="rect">
-                      <a:avLst/>
-                    </a:prstGeom>
+                    <a:prstGeom prst="rect"/>
                   </pic:spPr>
                 </pic:pic>
               </a:graphicData>
@@ -4649,41 +4128,34 @@
           <w:color w:val="000000"/>
           <w:sz w:val="24"/>
         </w:rPr>
-        <w:t>Рис. 1.13. Измененный JQL запрос.</w:t>
-      </w:r>
-    </w:p>
-    <w:p>
-      <w:pPr>
-        <w:spacing w:line="360" w:lineRule="auto"/>
+        <w:t>Рис. 1.7. Раздел «Qualified users».</w:t>
+      </w:r>
+    </w:p>
+    <w:bookmarkEnd w:id="12"/>
+    <w:p>
+      <w:pPr>
+        <w:spacing w:line="360" w:lineRule="auto" w:before="160" w:after="60"/>
+        <w:ind w:firstLine="0"/>
         <w:jc w:val="center"/>
       </w:pPr>
-      <w:r>
-        <w:rPr>
-          <w:noProof/>
-        </w:rPr>
+      <w:r/>
+      <w:r>
         <w:drawing>
-          <wp:inline distT="0" distB="0" distL="0" distR="0" wp14:anchorId="3FB51289" wp14:editId="64C2BC42">
-            <wp:extent cx="4967659" cy="3767562"/>
-            <wp:effectExtent l="0" t="0" r="0" b="4445"/>
-            <wp:docPr id="1845347439" name="Рисунок 8" descr="Изображение выглядит как текст, снимок экрана, Шрифт&#10;&#10;Автоматически созданное описание"/>
+          <wp:inline xmlns:a="http://schemas.openxmlformats.org/drawingml/2006/main" xmlns:pic="http://schemas.openxmlformats.org/drawingml/2006/picture">
+            <wp:extent cx="5760000" cy="1463956"/>
+            <wp:docPr id="1845347447" name="Picture 1845347447"/>
             <wp:cNvGraphicFramePr>
-              <a:graphicFrameLocks xmlns:a="http://schemas.openxmlformats.org/drawingml/2006/main" noChangeAspect="1"/>
+              <a:graphicFrameLocks noChangeAspect="1"/>
             </wp:cNvGraphicFramePr>
-            <a:graphic xmlns:a="http://schemas.openxmlformats.org/drawingml/2006/main">
+            <a:graphic>
               <a:graphicData uri="http://schemas.openxmlformats.org/drawingml/2006/picture">
-                <pic:pic xmlns:pic="http://schemas.openxmlformats.org/drawingml/2006/picture">
+                <pic:pic>
                   <pic:nvPicPr>
-                    <pic:cNvPr id="1845347439" name="Рисунок 8" descr="Изображение выглядит как текст, снимок экрана, Шрифт&#10;&#10;Автоматически созданное описание"/>
+                    <pic:cNvPr id="0" name="Снимок экрана 2026-10-25 180905.png"/>
                     <pic:cNvPicPr/>
                   </pic:nvPicPr>
                   <pic:blipFill>
-                    <a:blip r:embed="rId17">
-                      <a:extLst>
-                        <a:ext uri="{28A0092B-C50C-407E-A947-70E740481C1C}">
-                          <a14:useLocalDpi xmlns:a14="http://schemas.microsoft.com/office/drawing/2010/main" val="0"/>
-                        </a:ext>
-                      </a:extLst>
-                    </a:blip>
+                    <a:blip r:embed="rId30"/>
                     <a:stretch>
                       <a:fillRect/>
                     </a:stretch>
@@ -4691,11 +4163,410 @@
                   <pic:spPr>
                     <a:xfrm>
                       <a:off x="0" y="0"/>
-                      <a:ext cx="5040402" cy="3822732"/>
+                      <a:ext cx="5760000" cy="1463956"/>
                     </a:xfrm>
-                    <a:prstGeom prst="rect">
-                      <a:avLst/>
-                    </a:prstGeom>
+                    <a:prstGeom prst="rect"/>
+                  </pic:spPr>
+                </pic:pic>
+              </a:graphicData>
+            </a:graphic>
+          </wp:inline>
+        </w:drawing>
+      </w:r>
+    </w:p>
+    <w:p>
+      <w:pPr>
+        <w:pStyle w:val="af1"/>
+        <w:jc w:val="center"/>
+        <w:rPr>
+          <w:lang w:val="en-US"/>
+        </w:rPr>
+      </w:pPr>
+      <w:r>
+        <w:rPr>
+          <w:rFonts w:ascii="Times New Roman" w:hAnsi="Times New Roman"/>
+          <w:b w:val="0"/>
+          <w:i/>
+          <w:color w:val="000000"/>
+          <w:sz w:val="24"/>
+        </w:rPr>
+        <w:t>Рис. 1.8. Раздел «Probable labels».</w:t>
+      </w:r>
+    </w:p>
+    <w:p>
+      <w:pPr>
+        <w:spacing w:line="360" w:lineRule="auto" w:before="160" w:after="60"/>
+        <w:ind w:firstLine="0"/>
+        <w:jc w:val="center"/>
+        <w:rPr>
+          <w:lang w:val="en-US"/>
+        </w:rPr>
+      </w:pPr>
+      <w:r/>
+      <w:r>
+        <w:drawing>
+          <wp:inline xmlns:a="http://schemas.openxmlformats.org/drawingml/2006/main" xmlns:pic="http://schemas.openxmlformats.org/drawingml/2006/picture">
+            <wp:extent cx="5760000" cy="592941"/>
+            <wp:docPr id="1845347448" name="Picture 1845347448"/>
+            <wp:cNvGraphicFramePr>
+              <a:graphicFrameLocks noChangeAspect="1"/>
+            </wp:cNvGraphicFramePr>
+            <a:graphic>
+              <a:graphicData uri="http://schemas.openxmlformats.org/drawingml/2006/picture">
+                <pic:pic>
+                  <pic:nvPicPr>
+                    <pic:cNvPr id="0" name="Снимок экрана 2026-10-25 181735.png"/>
+                    <pic:cNvPicPr/>
+                  </pic:nvPicPr>
+                  <pic:blipFill>
+                    <a:blip r:embed="rId31"/>
+                    <a:stretch>
+                      <a:fillRect/>
+                    </a:stretch>
+                  </pic:blipFill>
+                  <pic:spPr>
+                    <a:xfrm>
+                      <a:off x="0" y="0"/>
+                      <a:ext cx="5760000" cy="592941"/>
+                    </a:xfrm>
+                    <a:prstGeom prst="rect"/>
+                  </pic:spPr>
+                </pic:pic>
+              </a:graphicData>
+            </a:graphic>
+          </wp:inline>
+        </w:drawing>
+      </w:r>
+    </w:p>
+    <w:p>
+      <w:pPr>
+        <w:pStyle w:val="af1"/>
+        <w:jc w:val="center"/>
+        <w:rPr>
+          <w:lang w:val="en-US"/>
+        </w:rPr>
+      </w:pPr>
+      <w:r>
+        <w:rPr>
+          <w:rFonts w:ascii="Times New Roman" w:hAnsi="Times New Roman"/>
+          <w:b w:val="0"/>
+          <w:i/>
+          <w:color w:val="000000"/>
+          <w:sz w:val="24"/>
+        </w:rPr>
+        <w:t>Рис. 1.9. Раздел «Probable attachments».</w:t>
+      </w:r>
+    </w:p>
+    <w:p>
+      <w:pPr>
+        <w:spacing w:line="360" w:lineRule="auto" w:before="160" w:after="60"/>
+        <w:ind w:firstLine="0"/>
+        <w:jc w:val="center"/>
+        <w:rPr>
+          <w:lang w:val="en-US"/>
+        </w:rPr>
+      </w:pPr>
+      <w:r/>
+      <w:r>
+        <w:drawing>
+          <wp:inline xmlns:a="http://schemas.openxmlformats.org/drawingml/2006/main" xmlns:pic="http://schemas.openxmlformats.org/drawingml/2006/picture">
+            <wp:extent cx="5760000" cy="2257369"/>
+            <wp:docPr id="1845347449" name="Picture 1845347449"/>
+            <wp:cNvGraphicFramePr>
+              <a:graphicFrameLocks noChangeAspect="1"/>
+            </wp:cNvGraphicFramePr>
+            <a:graphic>
+              <a:graphicData uri="http://schemas.openxmlformats.org/drawingml/2006/picture">
+                <pic:pic>
+                  <pic:nvPicPr>
+                    <pic:cNvPr id="0" name="Снимок экрана 2026-10-25 181823.png"/>
+                    <pic:cNvPicPr/>
+                  </pic:nvPicPr>
+                  <pic:blipFill>
+                    <a:blip r:embed="rId32"/>
+                    <a:stretch>
+                      <a:fillRect/>
+                    </a:stretch>
+                  </pic:blipFill>
+                  <pic:spPr>
+                    <a:xfrm>
+                      <a:off x="0" y="0"/>
+                      <a:ext cx="5760000" cy="2257369"/>
+                    </a:xfrm>
+                    <a:prstGeom prst="rect"/>
+                  </pic:spPr>
+                </pic:pic>
+              </a:graphicData>
+            </a:graphic>
+          </wp:inline>
+        </w:drawing>
+      </w:r>
+    </w:p>
+    <w:p>
+      <w:pPr>
+        <w:pStyle w:val="af1"/>
+        <w:jc w:val="center"/>
+        <w:rPr>
+          <w:lang w:val="en-US"/>
+        </w:rPr>
+      </w:pPr>
+      <w:r>
+        <w:rPr>
+          <w:rFonts w:ascii="Times New Roman" w:hAnsi="Times New Roman"/>
+          <w:b w:val="0"/>
+          <w:i/>
+          <w:color w:val="000000"/>
+          <w:sz w:val="24"/>
+        </w:rPr>
+        <w:t>Рис. 1.10. Раздел «Useful Documentation».</w:t>
+      </w:r>
+    </w:p>
+    <w:p>
+      <w:pPr>
+        <w:spacing w:line="360" w:lineRule="auto" w:before="160" w:after="60"/>
+        <w:ind w:firstLine="0"/>
+        <w:jc w:val="center"/>
+        <w:rPr>
+          <w:lang w:val="en-US"/>
+        </w:rPr>
+      </w:pPr>
+      <w:r/>
+      <w:r>
+        <w:drawing>
+          <wp:inline xmlns:a="http://schemas.openxmlformats.org/drawingml/2006/main" xmlns:pic="http://schemas.openxmlformats.org/drawingml/2006/picture">
+            <wp:extent cx="5760000" cy="2223529"/>
+            <wp:docPr id="1845347450" name="Picture 1845347450"/>
+            <wp:cNvGraphicFramePr>
+              <a:graphicFrameLocks noChangeAspect="1"/>
+            </wp:cNvGraphicFramePr>
+            <a:graphic>
+              <a:graphicData uri="http://schemas.openxmlformats.org/drawingml/2006/picture">
+                <pic:pic>
+                  <pic:nvPicPr>
+                    <pic:cNvPr id="0" name="Снимок экрана 2026-10-25 181855.png"/>
+                    <pic:cNvPicPr/>
+                  </pic:nvPicPr>
+                  <pic:blipFill>
+                    <a:blip r:embed="rId33"/>
+                    <a:stretch>
+                      <a:fillRect/>
+                    </a:stretch>
+                  </pic:blipFill>
+                  <pic:spPr>
+                    <a:xfrm>
+                      <a:off x="0" y="0"/>
+                      <a:ext cx="5760000" cy="2223529"/>
+                    </a:xfrm>
+                    <a:prstGeom prst="rect"/>
+                  </pic:spPr>
+                </pic:pic>
+              </a:graphicData>
+            </a:graphic>
+          </wp:inline>
+        </w:drawing>
+      </w:r>
+    </w:p>
+    <w:p>
+      <w:pPr>
+        <w:pStyle w:val="af1"/>
+        <w:jc w:val="center"/>
+        <w:rPr>
+          <w:lang w:val="en-US"/>
+        </w:rPr>
+      </w:pPr>
+      <w:r>
+        <w:rPr>
+          <w:rFonts w:ascii="Times New Roman" w:hAnsi="Times New Roman"/>
+          <w:b w:val="0"/>
+          <w:i/>
+          <w:color w:val="000000"/>
+          <w:sz w:val="24"/>
+        </w:rPr>
+        <w:t>Рис. 1.11. Раздел «Confluence pages».</w:t>
+      </w:r>
+    </w:p>
+    <w:p>
+      <w:pPr>
+        <w:spacing w:line="360" w:lineRule="auto" w:before="160" w:after="60"/>
+        <w:ind w:firstLine="0"/>
+        <w:jc w:val="center"/>
+        <w:rPr>
+          <w:lang w:val="en-US"/>
+        </w:rPr>
+      </w:pPr>
+      <w:r/>
+      <w:r>
+        <w:drawing>
+          <wp:inline xmlns:a="http://schemas.openxmlformats.org/drawingml/2006/main" xmlns:pic="http://schemas.openxmlformats.org/drawingml/2006/picture">
+            <wp:extent cx="5760000" cy="1076044"/>
+            <wp:docPr id="1845347451" name="Picture 1845347451"/>
+            <wp:cNvGraphicFramePr>
+              <a:graphicFrameLocks noChangeAspect="1"/>
+            </wp:cNvGraphicFramePr>
+            <a:graphic>
+              <a:graphicData uri="http://schemas.openxmlformats.org/drawingml/2006/picture">
+                <pic:pic>
+                  <pic:nvPicPr>
+                    <pic:cNvPr id="0" name="Снимок экрана 2026-10-25 181910.png"/>
+                    <pic:cNvPicPr/>
+                  </pic:nvPicPr>
+                  <pic:blipFill>
+                    <a:blip r:embed="rId34"/>
+                    <a:stretch>
+                      <a:fillRect/>
+                    </a:stretch>
+                  </pic:blipFill>
+                  <pic:spPr>
+                    <a:xfrm>
+                      <a:off x="0" y="0"/>
+                      <a:ext cx="5760000" cy="1076044"/>
+                    </a:xfrm>
+                    <a:prstGeom prst="rect"/>
+                  </pic:spPr>
+                </pic:pic>
+              </a:graphicData>
+            </a:graphic>
+          </wp:inline>
+        </w:drawing>
+      </w:r>
+    </w:p>
+    <w:p>
+      <w:pPr>
+        <w:pStyle w:val="af1"/>
+        <w:jc w:val="center"/>
+      </w:pPr>
+      <w:r>
+        <w:rPr>
+          <w:rFonts w:ascii="Times New Roman" w:hAnsi="Times New Roman"/>
+          <w:b w:val="0"/>
+          <w:i/>
+          <w:color w:val="000000"/>
+          <w:sz w:val="24"/>
+        </w:rPr>
+        <w:t>Рис. 1.12. Раздел «Proposals».</w:t>
+      </w:r>
+    </w:p>
+    <w:p>
+      <w:pPr>
+        <w:pStyle w:val="a3"/>
+      </w:pPr>
+      <w:r>
+        <w:t xml:space="preserve">Изменим </w:t>
+      </w:r>
+      <w:r>
+        <w:rPr>
+          <w:lang w:val="en-US"/>
+        </w:rPr>
+        <w:t>JQL</w:t>
+      </w:r>
+      <w:r>
+        <w:t xml:space="preserve"> </w:t>
+      </w:r>
+      <w:r>
+        <w:t xml:space="preserve">запрос и создадим новые правила на языке </w:t>
+      </w:r>
+      <w:r>
+        <w:rPr>
+          <w:lang w:val="en-US"/>
+        </w:rPr>
+        <w:t>Drool</w:t>
+      </w:r>
+      <w:r>
+        <w:t>.</w:t>
+      </w:r>
+    </w:p>
+    <w:p>
+      <w:pPr>
+        <w:spacing w:line="360" w:lineRule="auto" w:before="160" w:after="60"/>
+        <w:ind w:firstLine="0"/>
+        <w:jc w:val="center"/>
+      </w:pPr>
+      <w:r/>
+      <w:r>
+        <w:drawing>
+          <wp:inline xmlns:a="http://schemas.openxmlformats.org/drawingml/2006/main" xmlns:pic="http://schemas.openxmlformats.org/drawingml/2006/picture">
+            <wp:extent cx="5760000" cy="287155"/>
+            <wp:docPr id="1845347452" name="Picture 1845347452"/>
+            <wp:cNvGraphicFramePr>
+              <a:graphicFrameLocks noChangeAspect="1"/>
+            </wp:cNvGraphicFramePr>
+            <a:graphic>
+              <a:graphicData uri="http://schemas.openxmlformats.org/drawingml/2006/picture">
+                <pic:pic>
+                  <pic:nvPicPr>
+                    <pic:cNvPr id="0" name="Снимок экрана 2026-10-25 182127.png"/>
+                    <pic:cNvPicPr/>
+                  </pic:nvPicPr>
+                  <pic:blipFill>
+                    <a:blip r:embed="rId35"/>
+                    <a:stretch>
+                      <a:fillRect/>
+                    </a:stretch>
+                  </pic:blipFill>
+                  <pic:spPr>
+                    <a:xfrm>
+                      <a:off x="0" y="0"/>
+                      <a:ext cx="5760000" cy="287155"/>
+                    </a:xfrm>
+                    <a:prstGeom prst="rect"/>
+                  </pic:spPr>
+                </pic:pic>
+              </a:graphicData>
+            </a:graphic>
+          </wp:inline>
+        </w:drawing>
+      </w:r>
+    </w:p>
+    <w:p>
+      <w:pPr>
+        <w:pStyle w:val="af1"/>
+        <w:jc w:val="center"/>
+      </w:pPr>
+      <w:r>
+        <w:rPr>
+          <w:rFonts w:ascii="Times New Roman" w:hAnsi="Times New Roman"/>
+          <w:b w:val="0"/>
+          <w:i/>
+          <w:color w:val="000000"/>
+          <w:sz w:val="24"/>
+        </w:rPr>
+        <w:t>Рис. 1.13. Измененный JQL запрос.</w:t>
+      </w:r>
+    </w:p>
+    <w:p>
+      <w:pPr>
+        <w:spacing w:line="360" w:lineRule="auto" w:before="160" w:after="60"/>
+        <w:ind w:firstLine="0"/>
+        <w:jc w:val="center"/>
+      </w:pPr>
+      <w:r/>
+      <w:r>
+        <w:drawing>
+          <wp:inline xmlns:a="http://schemas.openxmlformats.org/drawingml/2006/main" xmlns:pic="http://schemas.openxmlformats.org/drawingml/2006/picture">
+            <wp:extent cx="5760000" cy="1935238"/>
+            <wp:docPr id="1845347453" name="Picture 1845347453"/>
+            <wp:cNvGraphicFramePr>
+              <a:graphicFrameLocks noChangeAspect="1"/>
+            </wp:cNvGraphicFramePr>
+            <a:graphic>
+              <a:graphicData uri="http://schemas.openxmlformats.org/drawingml/2006/picture">
+                <pic:pic>
+                  <pic:nvPicPr>
+                    <pic:cNvPr id="0" name="Снимок экрана 2026-10-25 182302.png"/>
+                    <pic:cNvPicPr/>
+                  </pic:nvPicPr>
+                  <pic:blipFill>
+                    <a:blip r:embed="rId36"/>
+                    <a:stretch>
+                      <a:fillRect/>
+                    </a:stretch>
+                  </pic:blipFill>
+                  <pic:spPr>
+                    <a:xfrm>
+                      <a:off x="0" y="0"/>
+                      <a:ext cx="5760000" cy="1935238"/>
+                    </a:xfrm>
+                    <a:prstGeom prst="rect"/>
                   </pic:spPr>
                 </pic:pic>
               </a:graphicData>
@@ -4943,164 +4814,31 @@
     <w:p>
       <w:pPr>
         <w:pStyle w:val="a3"/>
+        <w:spacing w:before="160" w:after="60"/>
         <w:ind w:firstLine="0"/>
         <w:jc w:val="center"/>
         <w:rPr>
           <w:lang w:val="en-US"/>
         </w:rPr>
       </w:pPr>
-      <w:r>
-        <w:rPr>
-          <w:lang w:val="en-US"/>
-        </w:rPr>
+      <w:r/>
+      <w:r>
         <w:drawing>
-          <wp:inline distT="0" distB="0" distL="0" distR="0" wp14:anchorId="1A442EEB" wp14:editId="6E99E0C9">
-            <wp:extent cx="4970284" cy="2840477"/>
-            <wp:effectExtent l="0" t="0" r="0" b="4445"/>
-            <wp:docPr id="770773790" name="Рисунок 1" descr="Изображение выглядит как текст, снимок экрана, программное обеспечение, дисплей&#10;&#10;Автоматически созданное описание"/>
+          <wp:inline xmlns:a="http://schemas.openxmlformats.org/drawingml/2006/main" xmlns:pic="http://schemas.openxmlformats.org/drawingml/2006/picture">
+            <wp:extent cx="5760000" cy="937059"/>
+            <wp:docPr id="1845347454" name="Picture 1845347454"/>
             <wp:cNvGraphicFramePr>
-              <a:graphicFrameLocks xmlns:a="http://schemas.openxmlformats.org/drawingml/2006/main" noChangeAspect="1"/>
+              <a:graphicFrameLocks noChangeAspect="1"/>
             </wp:cNvGraphicFramePr>
-            <a:graphic xmlns:a="http://schemas.openxmlformats.org/drawingml/2006/main">
+            <a:graphic>
               <a:graphicData uri="http://schemas.openxmlformats.org/drawingml/2006/picture">
-                <pic:pic xmlns:pic="http://schemas.openxmlformats.org/drawingml/2006/picture">
+                <pic:pic>
                   <pic:nvPicPr>
-                    <pic:cNvPr id="770773790" name="Рисунок 1" descr="Изображение выглядит как текст, снимок экрана, программное обеспечение, дисплей&#10;&#10;Автоматически созданное описание"/>
-                    <pic:cNvPicPr/>
-                  </pic:nvPicPr>
-                  <pic:blipFill rotWithShape="1">
-                    <a:blip r:embed="rId18"/>
-                    <a:srcRect t="5968" b="24608"/>
-                    <a:stretch/>
-                  </pic:blipFill>
-                  <pic:spPr bwMode="auto">
-                    <a:xfrm>
-                      <a:off x="0" y="0"/>
-                      <a:ext cx="5024840" cy="2871655"/>
-                    </a:xfrm>
-                    <a:prstGeom prst="rect">
-                      <a:avLst/>
-                    </a:prstGeom>
-                    <a:ln>
-                      <a:noFill/>
-                    </a:ln>
-                    <a:extLst>
-                      <a:ext uri="{53640926-AAD7-44D8-BBD7-CCE9431645EC}">
-                        <a14:shadowObscured xmlns:a14="http://schemas.microsoft.com/office/drawing/2010/main"/>
-                      </a:ext>
-                    </a:extLst>
-                  </pic:spPr>
-                </pic:pic>
-              </a:graphicData>
-            </a:graphic>
-          </wp:inline>
-        </w:drawing>
-      </w:r>
-    </w:p>
-    <w:p>
-      <w:pPr>
-        <w:pStyle w:val="af1"/>
-        <w:jc w:val="center"/>
-      </w:pPr>
-      <w:r>
-        <w:rPr>
-          <w:rFonts w:ascii="Times New Roman" w:hAnsi="Times New Roman"/>
-          <w:b w:val="0"/>
-          <w:i/>
-          <w:color w:val="000000"/>
-          <w:sz w:val="24"/>
-        </w:rPr>
-        <w:t>Рис. 1.15. Созданные правила в новом отчете.</w:t>
-      </w:r>
-    </w:p>
-    <w:p>
-      <w:pPr>
-        <w:spacing w:line="360" w:lineRule="auto" w:before="0" w:after="0"/>
-        <w:ind w:firstLine="709"/>
-        <w:jc w:val="both"/>
-      </w:pPr>
-      <w:r>
-        <w:rPr>
-          <w:rFonts w:ascii="Times New Roman" w:hAnsi="Times New Roman"/>
-          <w:b w:val="0"/>
-          <w:i w:val="0"/>
-          <w:color w:val="000000"/>
-          <w:sz w:val="28"/>
-        </w:rPr>
-        <w:t>В сгенерированном отчете (рис. 1.15) видно, как новые правила Drools успешно отработали на целевых открытых тикетах Apache Kafka:</w:t>
-      </w:r>
-    </w:p>
-    <w:p>
-      <w:pPr>
-        <w:spacing w:line="360" w:lineRule="auto" w:before="0" w:after="0"/>
-        <w:ind w:firstLine="709"/>
-        <w:jc w:val="both"/>
-      </w:pPr>
-      <w:r>
-        <w:rPr>
-          <w:rFonts w:ascii="Times New Roman" w:hAnsi="Times New Roman"/>
-          <w:b w:val="0"/>
-          <w:i w:val="0"/>
-          <w:color w:val="000000"/>
-          <w:sz w:val="28"/>
-        </w:rPr>
-        <w:t>• Для задачи KAFKA-16800 («Resolve Gradle 9.0 deprecations»), имеющей 7 подзадач и 3 комментария в статусе Open без назначенной версии, сработали предложения: «Resolve sub-tasks first before closing parent ticket», «Change task status to IN PROGRESS» и «Target fix version is missing: schedule for upcoming release milestone».</w:t>
-      </w:r>
-    </w:p>
-    <w:p>
-      <w:pPr>
-        <w:spacing w:line="360" w:lineRule="auto" w:before="0" w:after="0"/>
-        <w:ind w:firstLine="709"/>
-        <w:jc w:val="both"/>
-      </w:pPr>
-      <w:r>
-        <w:rPr>
-          <w:rFonts w:ascii="Times New Roman" w:hAnsi="Times New Roman"/>
-          <w:b w:val="0"/>
-          <w:i w:val="0"/>
-          <w:color w:val="000000"/>
-          <w:sz w:val="28"/>
-        </w:rPr>
-        <w:t>• Для задачи KAFKA-16628 («Add system test for validating static consumer bounce...»), не имеющей подзадач, правило о подзадачах корректно не сработало, однако сработали предложения о переводе в статус IN PROGRESS и указании fixVersion.</w:t>
-      </w:r>
-    </w:p>
-    <w:p>
-      <w:r>
-        <w:t xml:space="preserve">Откроем одну из задач и убедимся в том, что задача соответствует созданным правилам: </w:t>
-      </w:r>
-    </w:p>
-    <w:p>
-      <w:pPr>
-        <w:spacing w:line="360" w:lineRule="auto"/>
-        <w:jc w:val="center"/>
-      </w:pPr>
-      <w:r>
-        <w:rPr>
-          <w:noProof/>
-        </w:rPr>
-        <w:drawing>
-          <wp:inline distT="0" distB="0" distL="0" distR="0" wp14:anchorId="5DA08825" wp14:editId="506AB33D">
-            <wp:extent cx="3573394" cy="4299626"/>
-            <wp:effectExtent l="0" t="0" r="0" b="5715"/>
-            <wp:docPr id="272762103" name="Рисунок 9" descr="Изображение выглядит как текст, снимок экрана, программное обеспечение, веб-страница&#10;&#10;Автоматически созданное описание"/>
-            <wp:cNvGraphicFramePr>
-              <a:graphicFrameLocks xmlns:a="http://schemas.openxmlformats.org/drawingml/2006/main" noChangeAspect="1"/>
-            </wp:cNvGraphicFramePr>
-            <a:graphic xmlns:a="http://schemas.openxmlformats.org/drawingml/2006/main">
-              <a:graphicData uri="http://schemas.openxmlformats.org/drawingml/2006/picture">
-                <pic:pic xmlns:pic="http://schemas.openxmlformats.org/drawingml/2006/picture">
-                  <pic:nvPicPr>
-                    <pic:cNvPr id="272762103" name="Рисунок 9" descr="Изображение выглядит как текст, снимок экрана, программное обеспечение, веб-страница&#10;&#10;Автоматически созданное описание"/>
+                    <pic:cNvPr id="0" name="Снимок экрана 2026-10-25 182401.png"/>
                     <pic:cNvPicPr/>
                   </pic:nvPicPr>
                   <pic:blipFill>
-                    <a:blip r:embed="rId19">
-                      <a:extLst>
-                        <a:ext uri="{28A0092B-C50C-407E-A947-70E740481C1C}">
-                          <a14:useLocalDpi xmlns:a14="http://schemas.microsoft.com/office/drawing/2010/main" val="0"/>
-                        </a:ext>
-                      </a:extLst>
-                    </a:blip>
+                    <a:blip r:embed="rId37"/>
                     <a:stretch>
                       <a:fillRect/>
                     </a:stretch>
@@ -5108,11 +4846,9 @@
                   <pic:spPr>
                     <a:xfrm>
                       <a:off x="0" y="0"/>
-                      <a:ext cx="3636184" cy="4375177"/>
+                      <a:ext cx="5760000" cy="937059"/>
                     </a:xfrm>
-                    <a:prstGeom prst="rect">
-                      <a:avLst/>
-                    </a:prstGeom>
+                    <a:prstGeom prst="rect"/>
                   </pic:spPr>
                 </pic:pic>
               </a:graphicData>
@@ -5134,42 +4870,89 @@
           <w:color w:val="000000"/>
           <w:sz w:val="24"/>
         </w:rPr>
-        <w:t>Рис. 1.16. Проверка правил часть 1.</w:t>
-      </w:r>
-    </w:p>
-    <w:bookmarkEnd w:id="22"/>
-    <w:p>
-      <w:pPr>
+        <w:t>Рис. 1.15. Созданные правила в новом отчете.</w:t>
+      </w:r>
+    </w:p>
+    <w:p>
+      <w:pPr>
+        <w:spacing w:line="360" w:lineRule="auto" w:before="0" w:after="0"/>
+        <w:ind w:firstLine="709"/>
+        <w:jc w:val="both"/>
+      </w:pPr>
+      <w:r>
+        <w:rPr>
+          <w:rFonts w:ascii="Times New Roman" w:hAnsi="Times New Roman"/>
+          <w:b w:val="0"/>
+          <w:i w:val="0"/>
+          <w:color w:val="000000"/>
+          <w:sz w:val="28"/>
+        </w:rPr>
+        <w:t>В сгенерированном отчете (рис. 1.15) видно, как новые правила Drools успешно отработали на целевых открытых тикетах Apache Kafka:</w:t>
+      </w:r>
+    </w:p>
+    <w:p>
+      <w:pPr>
+        <w:spacing w:line="360" w:lineRule="auto" w:before="0" w:after="0"/>
+        <w:ind w:firstLine="709"/>
+        <w:jc w:val="both"/>
+      </w:pPr>
+      <w:r>
+        <w:rPr>
+          <w:rFonts w:ascii="Times New Roman" w:hAnsi="Times New Roman"/>
+          <w:b w:val="0"/>
+          <w:i w:val="0"/>
+          <w:color w:val="000000"/>
+          <w:sz w:val="28"/>
+        </w:rPr>
+        <w:t>• Для задачи KAFKA-16800 («Resolve Gradle 9.0 deprecations»), имеющей 7 подзадач и 3 комментария в статусе Open без назначенной версии, сработали предложения: «Resolve sub-tasks first before closing parent ticket», «Change task status to IN PROGRESS» и «Target fix version is missing: schedule for upcoming release milestone».</w:t>
+      </w:r>
+    </w:p>
+    <w:p>
+      <w:pPr>
+        <w:spacing w:line="360" w:lineRule="auto" w:before="0" w:after="0"/>
+        <w:ind w:firstLine="709"/>
+        <w:jc w:val="both"/>
+      </w:pPr>
+      <w:r>
+        <w:rPr>
+          <w:rFonts w:ascii="Times New Roman" w:hAnsi="Times New Roman"/>
+          <w:b w:val="0"/>
+          <w:i w:val="0"/>
+          <w:color w:val="000000"/>
+          <w:sz w:val="28"/>
+        </w:rPr>
+        <w:t>• Для задачи KAFKA-16628 («Add system test for validating static consumer bounce...»), не имеющей подзадач, правило о подзадачах корректно не сработало, однако сработали предложения о переводе в статус IN PROGRESS и указании fixVersion.</w:t>
+      </w:r>
+    </w:p>
+    <w:p>
+      <w:r>
+        <w:t xml:space="preserve">Откроем одну из задач и убедимся в том, что задача соответствует созданным правилам: </w:t>
+      </w:r>
+    </w:p>
+    <w:p>
+      <w:pPr>
+        <w:spacing w:line="360" w:lineRule="auto" w:before="160" w:after="60"/>
+        <w:ind w:firstLine="0"/>
         <w:jc w:val="center"/>
       </w:pPr>
-      <w:r>
-        <w:rPr>
-          <w:noProof/>
-        </w:rPr>
-        <w:lastRenderedPageBreak/>
+      <w:r/>
+      <w:r>
         <w:drawing>
-          <wp:inline distT="0" distB="0" distL="0" distR="0" wp14:anchorId="7BFCB0F1" wp14:editId="50AA369D">
-            <wp:extent cx="3340800" cy="856034"/>
-            <wp:effectExtent l="0" t="0" r="0" b="0"/>
-            <wp:docPr id="840556934" name="Рисунок 10" descr="Изображение выглядит как текст, Шрифт, белый, снимок экрана&#10;&#10;Автоматически созданное описание"/>
+          <wp:inline xmlns:a="http://schemas.openxmlformats.org/drawingml/2006/main" xmlns:pic="http://schemas.openxmlformats.org/drawingml/2006/picture">
+            <wp:extent cx="5760000" cy="2630463"/>
+            <wp:docPr id="1845347455" name="Picture 1845347455"/>
             <wp:cNvGraphicFramePr>
-              <a:graphicFrameLocks xmlns:a="http://schemas.openxmlformats.org/drawingml/2006/main" noChangeAspect="1"/>
+              <a:graphicFrameLocks noChangeAspect="1"/>
             </wp:cNvGraphicFramePr>
-            <a:graphic xmlns:a="http://schemas.openxmlformats.org/drawingml/2006/main">
+            <a:graphic>
               <a:graphicData uri="http://schemas.openxmlformats.org/drawingml/2006/picture">
-                <pic:pic xmlns:pic="http://schemas.openxmlformats.org/drawingml/2006/picture">
+                <pic:pic>
                   <pic:nvPicPr>
-                    <pic:cNvPr id="840556934" name="Рисунок 10" descr="Изображение выглядит как текст, Шрифт, белый, снимок экрана&#10;&#10;Автоматически созданное описание"/>
+                    <pic:cNvPr id="0" name="Снимок экрана 2026-10-25 182531.png"/>
                     <pic:cNvPicPr/>
                   </pic:nvPicPr>
                   <pic:blipFill>
-                    <a:blip r:embed="rId20">
-                      <a:extLst>
-                        <a:ext uri="{28A0092B-C50C-407E-A947-70E740481C1C}">
-                          <a14:useLocalDpi xmlns:a14="http://schemas.microsoft.com/office/drawing/2010/main" val="0"/>
-                        </a:ext>
-                      </a:extLst>
-                    </a:blip>
+                    <a:blip r:embed="rId38"/>
                     <a:stretch>
                       <a:fillRect/>
                     </a:stretch>
@@ -5177,11 +4960,68 @@
                   <pic:spPr>
                     <a:xfrm>
                       <a:off x="0" y="0"/>
-                      <a:ext cx="3442560" cy="882109"/>
+                      <a:ext cx="5760000" cy="2630463"/>
                     </a:xfrm>
-                    <a:prstGeom prst="rect">
-                      <a:avLst/>
-                    </a:prstGeom>
+                    <a:prstGeom prst="rect"/>
+                  </pic:spPr>
+                </pic:pic>
+              </a:graphicData>
+            </a:graphic>
+          </wp:inline>
+        </w:drawing>
+      </w:r>
+    </w:p>
+    <w:p>
+      <w:pPr>
+        <w:pStyle w:val="af1"/>
+        <w:jc w:val="center"/>
+      </w:pPr>
+      <w:r>
+        <w:rPr>
+          <w:rFonts w:ascii="Times New Roman" w:hAnsi="Times New Roman"/>
+          <w:b w:val="0"/>
+          <w:i/>
+          <w:color w:val="000000"/>
+          <w:sz w:val="24"/>
+        </w:rPr>
+        <w:t>Рис. 1.16. Проверка правил часть 1.</w:t>
+      </w:r>
+    </w:p>
+    <w:bookmarkEnd w:id="22"/>
+    <w:p>
+      <w:pPr>
+        <w:spacing w:before="160" w:after="60"/>
+        <w:ind w:firstLine="0"/>
+        <w:jc w:val="center"/>
+      </w:pPr>
+      <w:r/>
+      <w:r>
+        <w:drawing>
+          <wp:inline xmlns:a="http://schemas.openxmlformats.org/drawingml/2006/main" xmlns:pic="http://schemas.openxmlformats.org/drawingml/2006/picture">
+            <wp:extent cx="5760000" cy="2301457"/>
+            <wp:docPr id="1845347456" name="Picture 1845347456"/>
+            <wp:cNvGraphicFramePr>
+              <a:graphicFrameLocks noChangeAspect="1"/>
+            </wp:cNvGraphicFramePr>
+            <a:graphic>
+              <a:graphicData uri="http://schemas.openxmlformats.org/drawingml/2006/picture">
+                <pic:pic>
+                  <pic:nvPicPr>
+                    <pic:cNvPr id="0" name="Снимок экрана 2026-10-25 182650.png"/>
+                    <pic:cNvPicPr/>
+                  </pic:nvPicPr>
+                  <pic:blipFill>
+                    <a:blip r:embed="rId39"/>
+                    <a:stretch>
+                      <a:fillRect/>
+                    </a:stretch>
+                  </pic:blipFill>
+                  <pic:spPr>
+                    <a:xfrm>
+                      <a:off x="0" y="0"/>
+                      <a:ext cx="5760000" cy="2301457"/>
+                    </a:xfrm>
+                    <a:prstGeom prst="rect"/>
                   </pic:spPr>
                 </pic:pic>
               </a:graphicData>

</xml_diff>